<commit_message>
Added Problem statement and solution
</commit_message>
<xml_diff>
--- a/Report.docx
+++ b/Report.docx
@@ -27,6 +27,116 @@
         <w:rPr>
           <w:lang w:val="en-US"/>
         </w:rPr>
+        <w:t>Introduction</w:t>
+      </w:r>
+    </w:p>
+    <w:p>
+      <w:pPr>
+        <w:pStyle w:val="Heading2"/>
+        <w:rPr>
+          <w:lang w:val="en-US"/>
+        </w:rPr>
+      </w:pPr>
+      <w:r>
+        <w:rPr>
+          <w:lang w:val="en-US"/>
+        </w:rPr>
+        <w:t>Problem Statement</w:t>
+      </w:r>
+    </w:p>
+    <w:p>
+      <w:pPr>
+        <w:rPr>
+          <w:lang w:val="en-US"/>
+        </w:rPr>
+      </w:pPr>
+      <w:r>
+        <w:rPr>
+          <w:lang w:val="en-US"/>
+        </w:rPr>
+        <w:t>Stock prices change fast according to many external factors. One of them being marketing hype. News portals like Bloomberg</w:t>
+      </w:r>
+      <w:r>
+        <w:rPr>
+          <w:lang w:val="en-US"/>
+        </w:rPr>
+        <w:t xml:space="preserve">, CNN as well as social media threads in reddit or X </w:t>
+      </w:r>
+      <w:r>
+        <w:rPr>
+          <w:lang w:val="en-US"/>
+        </w:rPr>
+        <w:t xml:space="preserve"> </w:t>
+      </w:r>
+      <w:r>
+        <w:rPr>
+          <w:lang w:val="en-US"/>
+        </w:rPr>
+        <w:t xml:space="preserve">have valuable information to extract sentiment towards certain companies / their products. Positive sentiment might indicate a </w:t>
+      </w:r>
+      <w:r>
+        <w:rPr>
+          <w:lang w:val="en-US"/>
+        </w:rPr>
+        <w:t xml:space="preserve">possible increase in stock market price and </w:t>
+      </w:r>
+      <w:r>
+        <w:rPr>
+          <w:lang w:val="en-US"/>
+        </w:rPr>
+        <w:t>negative sentiment might indicate the opposite.</w:t>
+      </w:r>
+    </w:p>
+    <w:p>
+      <w:pPr>
+        <w:pStyle w:val="Heading2"/>
+        <w:rPr>
+          <w:lang w:val="en-US"/>
+        </w:rPr>
+      </w:pPr>
+      <w:r>
+        <w:rPr>
+          <w:lang w:val="en-US"/>
+        </w:rPr>
+        <w:t>Proposed Solution</w:t>
+      </w:r>
+    </w:p>
+    <w:p>
+      <w:pPr>
+        <w:rPr>
+          <w:lang w:val="en-US"/>
+        </w:rPr>
+      </w:pPr>
+      <w:r>
+        <w:rPr>
+          <w:lang w:val="en-US"/>
+        </w:rPr>
+        <w:t xml:space="preserve">A solution could be an app that </w:t>
+      </w:r>
+      <w:r>
+        <w:rPr>
+          <w:lang w:val="en-US"/>
+        </w:rPr>
+        <w:t xml:space="preserve">scrapes, analyses and evaluates the sentiment of the public / news of these companies and </w:t>
+      </w:r>
+      <w:r>
+        <w:rPr>
+          <w:lang w:val="en-US"/>
+        </w:rPr>
+        <w:t>predicts the trend of the stock prices in the immediate future.</w:t>
+      </w:r>
+    </w:p>
+    <w:p>
+      <w:pPr>
+        <w:pStyle w:val="Heading1"/>
+        <w:rPr>
+          <w:lang w:val="en-US"/>
+        </w:rPr>
+      </w:pPr>
+      <w:r>
+        <w:rPr>
+          <w:lang w:val="en-US"/>
+        </w:rPr>
         <w:t>Part 1</w:t>
       </w:r>
     </w:p>
@@ -46,6 +156,9 @@
     </w:p>
     <w:p>
       <w:r>
+        <w:rPr>
+          <w:noProof/>
+        </w:rPr>
         <w:drawing>
           <wp:inline distT="0" distB="0" distL="0" distR="0" wp14:anchorId="2902E3D7" wp14:editId="160A26A1">
             <wp:extent cx="5057775" cy="3661225"/>
@@ -128,6 +241,7 @@
           <w:b w:val="0"/>
           <w:bCs w:val="0"/>
         </w:rPr>
+        <w:lastRenderedPageBreak/>
         <w:t xml:space="preserve">Simulates a live stock exchange feed. </w:t>
       </w:r>
     </w:p>
@@ -231,15 +345,7 @@
           <w:b w:val="0"/>
           <w:bCs w:val="0"/>
         </w:rPr>
-        <w:t xml:space="preserve"> </w:t>
-      </w:r>
-      <w:r>
-        <w:rPr>
-          <w:rStyle w:val="Strong"/>
-          <w:b w:val="0"/>
-          <w:bCs w:val="0"/>
-        </w:rPr>
-        <w:t>and writes to Kafka</w:t>
+        <w:t xml:space="preserve"> and writes to Kafka</w:t>
       </w:r>
     </w:p>
     <w:p>
@@ -316,7 +422,6 @@
         <w:rPr>
           <w:rStyle w:val="Strong"/>
         </w:rPr>
-        <w:lastRenderedPageBreak/>
         <w:t>Consumer_sink_[stock, news]</w:t>
       </w:r>
     </w:p>
@@ -477,6 +582,7 @@
         <w:pStyle w:val="Heading2"/>
       </w:pPr>
       <w:r>
+        <w:lastRenderedPageBreak/>
         <w:t>Kafka features used</w:t>
       </w:r>
     </w:p>
@@ -556,7 +662,6 @@
         </w:numPr>
       </w:pPr>
       <w:r>
-        <w:lastRenderedPageBreak/>
         <w:t>Has their own dependencies (relevant in a bigger application)</w:t>
       </w:r>
     </w:p>
@@ -2104,6 +2209,7 @@
   <w:style w:type="character" w:default="1" w:styleId="DefaultParagraphFont">
     <w:name w:val="Default Paragraph Font"/>
     <w:uiPriority w:val="1"/>
+    <w:semiHidden/>
     <w:unhideWhenUsed/>
   </w:style>
   <w:style w:type="table" w:default="1" w:styleId="TableNormal">

</xml_diff>

<commit_message>
progressed Part 2 and 3
</commit_message>
<xml_diff>
--- a/Report.docx
+++ b/Report.docx
@@ -411,13 +411,6 @@
           <w:rStyle w:val="Strong"/>
         </w:rPr>
       </w:pPr>
-    </w:p>
-    <w:p>
-      <w:pPr>
-        <w:rPr>
-          <w:rStyle w:val="Strong"/>
-        </w:rPr>
-      </w:pPr>
       <w:r>
         <w:rPr>
           <w:rStyle w:val="Strong"/>
@@ -665,7 +658,792 @@
         <w:t>Has their own dependencies (relevant in a bigger application)</w:t>
       </w:r>
     </w:p>
+    <w:p>
+      <w:pPr>
+        <w:pStyle w:val="Heading1"/>
+      </w:pPr>
+      <w:r>
+        <w:t>Part 2</w:t>
+      </w:r>
+    </w:p>
+    <w:p>
+      <w:pPr>
+        <w:pStyle w:val="Heading2"/>
+      </w:pPr>
+      <w:r>
+        <w:t>Consumer Groups</w:t>
+      </w:r>
+    </w:p>
+    <w:p>
+      <w:r>
+        <w:t>I did 2 experiments with consumer groups</w:t>
+      </w:r>
+      <w:r>
+        <w:t>.</w:t>
+      </w:r>
+    </w:p>
+    <w:p>
+      <w:pPr>
+        <w:rPr>
+          <w:b/>
+          <w:bCs/>
+        </w:rPr>
+      </w:pPr>
+      <w:r>
+        <w:rPr>
+          <w:b/>
+          <w:bCs/>
+        </w:rPr>
+        <w:t xml:space="preserve">Experiment </w:t>
+      </w:r>
+      <w:r>
+        <w:rPr>
+          <w:b/>
+          <w:bCs/>
+        </w:rPr>
+        <w:t xml:space="preserve">1: </w:t>
+      </w:r>
+      <w:r>
+        <w:rPr>
+          <w:b/>
+          <w:bCs/>
+        </w:rPr>
+        <w:t>Fan out</w:t>
+      </w:r>
+    </w:p>
+    <w:p>
+      <w:pPr>
+        <w:rPr>
+          <w:lang w:val="en-CH"/>
+        </w:rPr>
+      </w:pPr>
+      <w:r>
+        <w:t>Two consumers in different groups both recei</w:t>
+      </w:r>
+      <w:r>
+        <w:t>ve</w:t>
+      </w:r>
+      <w:r>
+        <w:t xml:space="preserve"> every</w:t>
+      </w:r>
+      <w:r>
+        <w:t xml:space="preserve"> message</w:t>
+      </w:r>
+      <w:r>
+        <w:t>. This is basically how my current setup already works (</w:t>
+      </w:r>
+      <w:r>
+        <w:t xml:space="preserve">news-sink-group and </w:t>
+      </w:r>
+      <w:r>
+        <w:rPr>
+          <w:lang w:val="en-CH"/>
+        </w:rPr>
+        <w:t>signal-processor-group</w:t>
+      </w:r>
+      <w:r>
+        <w:rPr>
+          <w:lang w:val="en-CH"/>
+        </w:rPr>
+        <w:t xml:space="preserve"> consume </w:t>
+      </w:r>
+      <w:r>
+        <w:rPr>
+          <w:lang w:val="en-CH"/>
+        </w:rPr>
+        <w:t xml:space="preserve">all messages </w:t>
+      </w:r>
+      <w:r>
+        <w:rPr>
+          <w:lang w:val="en-CH"/>
+        </w:rPr>
+        <w:t>from the news-post topic)</w:t>
+      </w:r>
+      <w:r>
+        <w:rPr>
+          <w:lang w:val="en-CH"/>
+        </w:rPr>
+        <w:t>.</w:t>
+      </w:r>
+    </w:p>
+    <w:p>
+      <w:pPr>
+        <w:rPr>
+          <w:lang w:val="en-CH"/>
+        </w:rPr>
+      </w:pPr>
+      <w:r>
+        <w:rPr>
+          <w:lang w:val="en-CH"/>
+        </w:rPr>
+        <w:t>Two different consumers (instance-1 and instance-2) will run in different consumer groups (</w:t>
+      </w:r>
+      <w:r>
+        <w:rPr>
+          <w:lang w:val="en-CH"/>
+        </w:rPr>
+        <w:t>group-a &amp; group-b). As expected, noth receive all data from the topic stock-ticks</w:t>
+      </w:r>
+      <w:r>
+        <w:rPr>
+          <w:lang w:val="en-CH"/>
+        </w:rPr>
+        <w:t>, because they consume independently from each other.</w:t>
+      </w:r>
+    </w:p>
+    <w:p>
+      <w:pPr>
+        <w:rPr>
+          <w:b/>
+          <w:bCs/>
+          <w:lang w:val="en-CH"/>
+        </w:rPr>
+      </w:pPr>
+      <w:r>
+        <w:rPr>
+          <w:b/>
+          <w:bCs/>
+          <w:lang w:val="en-CH"/>
+        </w:rPr>
+        <w:t>Experiment B</w:t>
+      </w:r>
+      <w:r>
+        <w:rPr>
+          <w:b/>
+          <w:bCs/>
+          <w:lang w:val="en-CH"/>
+        </w:rPr>
+        <w:t xml:space="preserve">: </w:t>
+      </w:r>
+      <w:r>
+        <w:rPr>
+          <w:b/>
+          <w:bCs/>
+          <w:lang w:val="en-CH"/>
+        </w:rPr>
+        <w:t>Load balancing</w:t>
+      </w:r>
+    </w:p>
+    <w:p>
+      <w:pPr>
+        <w:rPr>
+          <w:lang w:val="en-CH"/>
+        </w:rPr>
+      </w:pPr>
+      <w:r>
+        <w:rPr>
+          <w:lang w:val="en-CH"/>
+        </w:rPr>
+        <w:t xml:space="preserve">Now </w:t>
+      </w:r>
+      <w:r>
+        <w:rPr>
+          <w:lang w:val="en-CH"/>
+        </w:rPr>
+        <w:t>2 consumers</w:t>
+      </w:r>
+      <w:r>
+        <w:rPr>
+          <w:lang w:val="en-CH"/>
+        </w:rPr>
+        <w:t xml:space="preserve"> </w:t>
+      </w:r>
+      <w:r>
+        <w:rPr>
+          <w:lang w:val="en-CH"/>
+        </w:rPr>
+        <w:t>(instance-1 and instance-2)</w:t>
+      </w:r>
+      <w:r>
+        <w:rPr>
+          <w:lang w:val="en-CH"/>
+        </w:rPr>
+        <w:t xml:space="preserve"> will run in tha same group</w:t>
+      </w:r>
+      <w:r>
+        <w:rPr>
+          <w:lang w:val="en-CH"/>
+        </w:rPr>
+        <w:t xml:space="preserve"> </w:t>
+      </w:r>
+      <w:r>
+        <w:rPr>
+          <w:lang w:val="en-CH"/>
+        </w:rPr>
+        <w:t>(group-a</w:t>
+      </w:r>
+      <w:r>
+        <w:rPr>
+          <w:lang w:val="en-CH"/>
+        </w:rPr>
+        <w:t>)</w:t>
+      </w:r>
+      <w:r>
+        <w:rPr>
+          <w:lang w:val="en-CH"/>
+        </w:rPr>
+        <w:t xml:space="preserve"> consuming messages from the same sink.</w:t>
+      </w:r>
+    </w:p>
+    <w:p>
+      <w:pPr>
+        <w:rPr>
+          <w:lang w:val="en-CH"/>
+        </w:rPr>
+      </w:pPr>
+      <w:r>
+        <w:rPr>
+          <w:lang w:val="en-CH"/>
+        </w:rPr>
+        <w:t>The output shows</w:t>
+      </w:r>
+      <w:r>
+        <w:rPr>
+          <w:lang w:val="en-CH"/>
+        </w:rPr>
+        <w:t>, that if 1 consumer is running, the other is blocked. The maximum parall</w:t>
+      </w:r>
+      <w:r>
+        <w:rPr>
+          <w:lang w:val="en-CH"/>
+        </w:rPr>
+        <w:t>elism within a consumer group is limitted by the number of partitions. Since there is only 1 partition in the stock-tick topic, only 1 consumer can receive all messages at the same time.</w:t>
+      </w:r>
+    </w:p>
+    <w:p>
+      <w:pPr>
+        <w:rPr>
+          <w:lang w:val="en-CH"/>
+        </w:rPr>
+      </w:pPr>
+      <w:r>
+        <w:rPr>
+          <w:lang w:val="en-CH"/>
+        </w:rPr>
+        <w:lastRenderedPageBreak/>
+        <w:t xml:space="preserve">Load balancing can be effective, when used with partitioning, which we will discuss </w:t>
+      </w:r>
+      <w:r>
+        <w:rPr>
+          <w:lang w:val="en-CH"/>
+        </w:rPr>
+        <w:t>in the followiung section.</w:t>
+      </w:r>
+    </w:p>
+    <w:p>
+      <w:pPr>
+        <w:pStyle w:val="Heading2"/>
+      </w:pPr>
+      <w:r>
+        <w:t>Partition counts &amp; Replication factors</w:t>
+      </w:r>
+    </w:p>
+    <w:p>
+      <w:r>
+        <w:t>I created</w:t>
+      </w:r>
+      <w:r>
+        <w:t xml:space="preserve"> a script</w:t>
+      </w:r>
+      <w:r>
+        <w:t xml:space="preserve"> (setup_topics.py)</w:t>
+      </w:r>
+      <w:r>
+        <w:t xml:space="preserve"> that creates topics with specific partition/replication configs so I can compare them. I created 3 versions of stock-ticks with different settings:</w:t>
+      </w:r>
+    </w:p>
+    <w:tbl>
+      <w:tblPr>
+        <w:tblStyle w:val="TableGrid"/>
+        <w:tblW w:w="0" w:type="auto"/>
+        <w:tblLook w:val="04A0" w:firstRow="1" w:lastRow="0" w:firstColumn="1" w:lastColumn="0" w:noHBand="0" w:noVBand="1"/>
+      </w:tblPr>
+      <w:tblGrid>
+        <w:gridCol w:w="2254"/>
+        <w:gridCol w:w="2254"/>
+        <w:gridCol w:w="2254"/>
+        <w:gridCol w:w="2254"/>
+      </w:tblGrid>
+      <w:tr>
+        <w:tc>
+          <w:tcPr>
+            <w:tcW w:w="2254" w:type="dxa"/>
+          </w:tcPr>
+          <w:p>
+            <w:r>
+              <w:t>Topic</w:t>
+            </w:r>
+          </w:p>
+        </w:tc>
+        <w:tc>
+          <w:tcPr>
+            <w:tcW w:w="2254" w:type="dxa"/>
+          </w:tcPr>
+          <w:p>
+            <w:r>
+              <w:t>Partition</w:t>
+            </w:r>
+          </w:p>
+        </w:tc>
+        <w:tc>
+          <w:tcPr>
+            <w:tcW w:w="2254" w:type="dxa"/>
+          </w:tcPr>
+          <w:p>
+            <w:r>
+              <w:t>Replication Factor</w:t>
+            </w:r>
+          </w:p>
+        </w:tc>
+        <w:tc>
+          <w:tcPr>
+            <w:tcW w:w="2254" w:type="dxa"/>
+          </w:tcPr>
+          <w:p>
+            <w:r>
+              <w:t>Purpose</w:t>
+            </w:r>
+          </w:p>
+        </w:tc>
+      </w:tr>
+      <w:tr>
+        <w:tc>
+          <w:tcPr>
+            <w:tcW w:w="2254" w:type="dxa"/>
+          </w:tcPr>
+          <w:p>
+            <w:r>
+              <w:t>stock-ticks-p1-r1</w:t>
+            </w:r>
+          </w:p>
+        </w:tc>
+        <w:tc>
+          <w:tcPr>
+            <w:tcW w:w="2254" w:type="dxa"/>
+          </w:tcPr>
+          <w:p>
+            <w:r>
+              <w:t>1</w:t>
+            </w:r>
+          </w:p>
+        </w:tc>
+        <w:tc>
+          <w:tcPr>
+            <w:tcW w:w="2254" w:type="dxa"/>
+          </w:tcPr>
+          <w:p>
+            <w:r>
+              <w:t>1</w:t>
+            </w:r>
+          </w:p>
+        </w:tc>
+        <w:tc>
+          <w:tcPr>
+            <w:tcW w:w="2254" w:type="dxa"/>
+          </w:tcPr>
+          <w:p>
+            <w:r>
+              <w:t>Baseline, no parallelism, no fault tolerance</w:t>
+            </w:r>
+          </w:p>
+        </w:tc>
+      </w:tr>
+      <w:tr>
+        <w:tc>
+          <w:tcPr>
+            <w:tcW w:w="2254" w:type="dxa"/>
+          </w:tcPr>
+          <w:p>
+            <w:r>
+              <w:t>stock-ticks-p</w:t>
+            </w:r>
+            <w:r>
+              <w:t>3</w:t>
+            </w:r>
+            <w:r>
+              <w:t>-r</w:t>
+            </w:r>
+            <w:r>
+              <w:t>1</w:t>
+            </w:r>
+          </w:p>
+        </w:tc>
+        <w:tc>
+          <w:tcPr>
+            <w:tcW w:w="2254" w:type="dxa"/>
+          </w:tcPr>
+          <w:p>
+            <w:r>
+              <w:t>3</w:t>
+            </w:r>
+          </w:p>
+        </w:tc>
+        <w:tc>
+          <w:tcPr>
+            <w:tcW w:w="2254" w:type="dxa"/>
+          </w:tcPr>
+          <w:p>
+            <w:r>
+              <w:t>1</w:t>
+            </w:r>
+          </w:p>
+        </w:tc>
+        <w:tc>
+          <w:tcPr>
+            <w:tcW w:w="2254" w:type="dxa"/>
+          </w:tcPr>
+          <w:p>
+            <w:r>
+              <w:t>Parallelism, no fault tolerance</w:t>
+            </w:r>
+          </w:p>
+        </w:tc>
+      </w:tr>
+      <w:tr>
+        <w:tc>
+          <w:tcPr>
+            <w:tcW w:w="2254" w:type="dxa"/>
+          </w:tcPr>
+          <w:p>
+            <w:r>
+              <w:t>stock-ticks-p</w:t>
+            </w:r>
+            <w:r>
+              <w:t>3</w:t>
+            </w:r>
+            <w:r>
+              <w:t>-r</w:t>
+            </w:r>
+            <w:r>
+              <w:t>3</w:t>
+            </w:r>
+          </w:p>
+        </w:tc>
+        <w:tc>
+          <w:tcPr>
+            <w:tcW w:w="2254" w:type="dxa"/>
+          </w:tcPr>
+          <w:p>
+            <w:r>
+              <w:t>3</w:t>
+            </w:r>
+          </w:p>
+        </w:tc>
+        <w:tc>
+          <w:tcPr>
+            <w:tcW w:w="2254" w:type="dxa"/>
+          </w:tcPr>
+          <w:p>
+            <w:r>
+              <w:t>3</w:t>
+            </w:r>
+          </w:p>
+        </w:tc>
+        <w:tc>
+          <w:tcPr>
+            <w:tcW w:w="2254" w:type="dxa"/>
+          </w:tcPr>
+          <w:p>
+            <w:r>
+              <w:t>Parallelism + fault tolerance</w:t>
+            </w:r>
+          </w:p>
+        </w:tc>
+      </w:tr>
+    </w:tbl>
     <w:p/>
+    <w:p>
+      <w:pPr>
+        <w:rPr>
+          <w:b/>
+          <w:bCs/>
+        </w:rPr>
+      </w:pPr>
+      <w:r>
+        <w:rPr>
+          <w:b/>
+          <w:bCs/>
+        </w:rPr>
+        <w:t>Partition details</w:t>
+      </w:r>
+    </w:p>
+    <w:p>
+      <w:pPr>
+        <w:rPr>
+          <w:lang w:val="en-CH"/>
+        </w:rPr>
+      </w:pPr>
+      <w:r>
+        <w:rPr>
+          <w:lang w:val="en-CH"/>
+        </w:rPr>
+        <w:t>stock-ticks-p1-r1</w:t>
+      </w:r>
+    </w:p>
+    <w:p>
+      <w:pPr>
+        <w:rPr>
+          <w:b/>
+          <w:bCs/>
+        </w:rPr>
+      </w:pPr>
+      <w:r>
+        <w:rPr>
+          <w:b/>
+          <w:bCs/>
+        </w:rPr>
+        <w:drawing>
+          <wp:inline distT="0" distB="0" distL="0" distR="0" wp14:anchorId="081BA450" wp14:editId="466D3F83">
+            <wp:extent cx="5731510" cy="838200"/>
+            <wp:effectExtent l="0" t="0" r="2540" b="0"/>
+            <wp:docPr id="341616222" name="Picture 1"/>
+            <wp:cNvGraphicFramePr>
+              <a:graphicFrameLocks xmlns:a="http://schemas.openxmlformats.org/drawingml/2006/main" noChangeAspect="1"/>
+            </wp:cNvGraphicFramePr>
+            <a:graphic xmlns:a="http://schemas.openxmlformats.org/drawingml/2006/main">
+              <a:graphicData uri="http://schemas.openxmlformats.org/drawingml/2006/picture">
+                <pic:pic xmlns:pic="http://schemas.openxmlformats.org/drawingml/2006/picture">
+                  <pic:nvPicPr>
+                    <pic:cNvPr id="341616222" name=""/>
+                    <pic:cNvPicPr/>
+                  </pic:nvPicPr>
+                  <pic:blipFill>
+                    <a:blip r:embed="rId6"/>
+                    <a:stretch>
+                      <a:fillRect/>
+                    </a:stretch>
+                  </pic:blipFill>
+                  <pic:spPr>
+                    <a:xfrm>
+                      <a:off x="0" y="0"/>
+                      <a:ext cx="5731510" cy="838200"/>
+                    </a:xfrm>
+                    <a:prstGeom prst="rect">
+                      <a:avLst/>
+                    </a:prstGeom>
+                  </pic:spPr>
+                </pic:pic>
+              </a:graphicData>
+            </a:graphic>
+          </wp:inline>
+        </w:drawing>
+      </w:r>
+    </w:p>
+    <w:p>
+      <w:pPr>
+        <w:rPr>
+          <w:lang w:val="en-CH"/>
+        </w:rPr>
+      </w:pPr>
+      <w:r>
+        <w:rPr>
+          <w:lang w:val="en-CH"/>
+        </w:rPr>
+        <w:t>stock-ticks-p3-r1</w:t>
+      </w:r>
+    </w:p>
+    <w:p>
+      <w:pPr>
+        <w:rPr>
+          <w:b/>
+          <w:bCs/>
+        </w:rPr>
+      </w:pPr>
+      <w:r>
+        <w:rPr>
+          <w:b/>
+          <w:bCs/>
+        </w:rPr>
+        <w:drawing>
+          <wp:inline distT="0" distB="0" distL="0" distR="0" wp14:anchorId="7F8D079F" wp14:editId="6152B3AE">
+            <wp:extent cx="5731510" cy="1259840"/>
+            <wp:effectExtent l="0" t="0" r="2540" b="0"/>
+            <wp:docPr id="1891742606" name="Picture 1"/>
+            <wp:cNvGraphicFramePr>
+              <a:graphicFrameLocks xmlns:a="http://schemas.openxmlformats.org/drawingml/2006/main" noChangeAspect="1"/>
+            </wp:cNvGraphicFramePr>
+            <a:graphic xmlns:a="http://schemas.openxmlformats.org/drawingml/2006/main">
+              <a:graphicData uri="http://schemas.openxmlformats.org/drawingml/2006/picture">
+                <pic:pic xmlns:pic="http://schemas.openxmlformats.org/drawingml/2006/picture">
+                  <pic:nvPicPr>
+                    <pic:cNvPr id="1891742606" name=""/>
+                    <pic:cNvPicPr/>
+                  </pic:nvPicPr>
+                  <pic:blipFill>
+                    <a:blip r:embed="rId7"/>
+                    <a:stretch>
+                      <a:fillRect/>
+                    </a:stretch>
+                  </pic:blipFill>
+                  <pic:spPr>
+                    <a:xfrm>
+                      <a:off x="0" y="0"/>
+                      <a:ext cx="5731510" cy="1259840"/>
+                    </a:xfrm>
+                    <a:prstGeom prst="rect">
+                      <a:avLst/>
+                    </a:prstGeom>
+                  </pic:spPr>
+                </pic:pic>
+              </a:graphicData>
+            </a:graphic>
+          </wp:inline>
+        </w:drawing>
+      </w:r>
+    </w:p>
+    <w:p>
+      <w:pPr>
+        <w:rPr>
+          <w:lang w:val="en-CH"/>
+        </w:rPr>
+      </w:pPr>
+      <w:r>
+        <w:rPr>
+          <w:lang w:val="en-CH"/>
+        </w:rPr>
+        <w:t>stock-ticks-p3-r3</w:t>
+      </w:r>
+    </w:p>
+    <w:p>
+      <w:pPr>
+        <w:rPr>
+          <w:b/>
+          <w:bCs/>
+        </w:rPr>
+      </w:pPr>
+      <w:r>
+        <w:rPr>
+          <w:b/>
+          <w:bCs/>
+        </w:rPr>
+        <w:drawing>
+          <wp:inline distT="0" distB="0" distL="0" distR="0" wp14:anchorId="09D8818C" wp14:editId="06DF7D0C">
+            <wp:extent cx="5731510" cy="1256665"/>
+            <wp:effectExtent l="0" t="0" r="2540" b="635"/>
+            <wp:docPr id="729731150" name="Picture 1"/>
+            <wp:cNvGraphicFramePr>
+              <a:graphicFrameLocks xmlns:a="http://schemas.openxmlformats.org/drawingml/2006/main" noChangeAspect="1"/>
+            </wp:cNvGraphicFramePr>
+            <a:graphic xmlns:a="http://schemas.openxmlformats.org/drawingml/2006/main">
+              <a:graphicData uri="http://schemas.openxmlformats.org/drawingml/2006/picture">
+                <pic:pic xmlns:pic="http://schemas.openxmlformats.org/drawingml/2006/picture">
+                  <pic:nvPicPr>
+                    <pic:cNvPr id="729731150" name=""/>
+                    <pic:cNvPicPr/>
+                  </pic:nvPicPr>
+                  <pic:blipFill>
+                    <a:blip r:embed="rId8"/>
+                    <a:stretch>
+                      <a:fillRect/>
+                    </a:stretch>
+                  </pic:blipFill>
+                  <pic:spPr>
+                    <a:xfrm>
+                      <a:off x="0" y="0"/>
+                      <a:ext cx="5731510" cy="1256665"/>
+                    </a:xfrm>
+                    <a:prstGeom prst="rect">
+                      <a:avLst/>
+                    </a:prstGeom>
+                  </pic:spPr>
+                </pic:pic>
+              </a:graphicData>
+            </a:graphic>
+          </wp:inline>
+        </w:drawing>
+      </w:r>
+    </w:p>
+    <w:p>
+      <w:r>
+        <w:lastRenderedPageBreak/>
+        <w:t xml:space="preserve">The details </w:t>
+      </w:r>
+      <w:r>
+        <w:t>show information about the topic. To note is the Leader Node for further experiments. This is assigned by kafka</w:t>
+      </w:r>
+      <w:r>
+        <w:t xml:space="preserve"> automatically across brokers</w:t>
+      </w:r>
+    </w:p>
+    <w:p>
+      <w:pPr>
+        <w:rPr>
+          <w:b/>
+          <w:bCs/>
+        </w:rPr>
+      </w:pPr>
+      <w:r>
+        <w:rPr>
+          <w:b/>
+          <w:bCs/>
+        </w:rPr>
+        <w:t xml:space="preserve">Experiment 1: </w:t>
+      </w:r>
+      <w:r>
+        <w:rPr>
+          <w:b/>
+          <w:bCs/>
+        </w:rPr>
+        <w:t>O</w:t>
+      </w:r>
+      <w:r>
+        <w:rPr>
+          <w:b/>
+          <w:bCs/>
+        </w:rPr>
+        <w:t>bserve topic layouts in Kafdrop</w:t>
+      </w:r>
+    </w:p>
+    <w:p>
+      <w:r>
+        <w:t>Partition</w:t>
+      </w:r>
+    </w:p>
+    <w:p>
+      <w:pPr>
+        <w:rPr>
+          <w:b/>
+          <w:bCs/>
+        </w:rPr>
+      </w:pPr>
+    </w:p>
+    <w:p>
+      <w:pPr>
+        <w:rPr>
+          <w:b/>
+          <w:bCs/>
+        </w:rPr>
+      </w:pPr>
+      <w:r>
+        <w:rPr>
+          <w:b/>
+          <w:bCs/>
+        </w:rPr>
+        <w:t xml:space="preserve">Experiment 2: </w:t>
+      </w:r>
+      <w:r>
+        <w:rPr>
+          <w:b/>
+          <w:bCs/>
+        </w:rPr>
+        <w:t>K</w:t>
+      </w:r>
+      <w:r>
+        <w:rPr>
+          <w:b/>
+          <w:bCs/>
+        </w:rPr>
+        <w:t>ill a broker, observe fault tolerance</w:t>
+      </w:r>
+    </w:p>
+    <w:p>
+      <w:pPr>
+        <w:pStyle w:val="Heading1"/>
+      </w:pPr>
+      <w:r>
+        <w:t>Part 3</w:t>
+      </w:r>
+    </w:p>
     <w:p/>
     <w:sectPr>
       <w:pgSz w:w="11906" w:h="16838"/>
@@ -2209,7 +2987,6 @@
   <w:style w:type="character" w:default="1" w:styleId="DefaultParagraphFont">
     <w:name w:val="Default Paragraph Font"/>
     <w:uiPriority w:val="1"/>
-    <w:semiHidden/>
     <w:unhideWhenUsed/>
   </w:style>
   <w:style w:type="table" w:default="1" w:styleId="TableNormal">
@@ -2532,6 +3309,25 @@
       <w:bCs/>
     </w:rPr>
   </w:style>
+  <w:style w:type="table" w:styleId="TableGrid">
+    <w:name w:val="Table Grid"/>
+    <w:basedOn w:val="TableNormal"/>
+    <w:uiPriority w:val="39"/>
+    <w:rsid w:val="00D1303A"/>
+    <w:pPr>
+      <w:spacing w:after="0" w:line="240" w:lineRule="auto"/>
+    </w:pPr>
+    <w:tblPr>
+      <w:tblBorders>
+        <w:top w:val="single" w:sz="4" w:space="0" w:color="auto"/>
+        <w:left w:val="single" w:sz="4" w:space="0" w:color="auto"/>
+        <w:bottom w:val="single" w:sz="4" w:space="0" w:color="auto"/>
+        <w:right w:val="single" w:sz="4" w:space="0" w:color="auto"/>
+        <w:insideH w:val="single" w:sz="4" w:space="0" w:color="auto"/>
+        <w:insideV w:val="single" w:sz="4" w:space="0" w:color="auto"/>
+      </w:tblBorders>
+    </w:tblPr>
+  </w:style>
 </w:styles>
 </file>
 

</xml_diff>

<commit_message>
finished part 4 & 5
</commit_message>
<xml_diff>
--- a/Report.docx
+++ b/Report.docx
@@ -215,11 +215,34 @@
           <w:rStyle w:val="Strong"/>
         </w:rPr>
       </w:pPr>
-      <w:r>
+    </w:p>
+    <w:p>
+      <w:pPr>
+        <w:pStyle w:val="Heading4"/>
         <w:rPr>
           <w:rStyle w:val="Strong"/>
-        </w:rPr>
+          <w:b w:val="0"/>
+          <w:bCs w:val="0"/>
+        </w:rPr>
+      </w:pPr>
+      <w:r>
+        <w:rPr>
+          <w:rStyle w:val="Strong"/>
+          <w:b w:val="0"/>
+          <w:bCs w:val="0"/>
+        </w:rPr>
+        <w:lastRenderedPageBreak/>
         <w:t>Stock_producer</w:t>
+      </w:r>
+    </w:p>
+    <w:p>
+      <w:r>
+        <w:rPr>
+          <w:i/>
+          <w:iCs/>
+          <w:color w:val="124F1A" w:themeColor="accent3" w:themeShade="BF"/>
+        </w:rPr>
+        <w:t>docker-compose -f docker-compose-kafka.yaml --profile producers up stock-producer</w:t>
       </w:r>
     </w:p>
     <w:p>
@@ -241,7 +264,6 @@
           <w:b w:val="0"/>
           <w:bCs w:val="0"/>
         </w:rPr>
-        <w:lastRenderedPageBreak/>
         <w:t xml:space="preserve">Simulates a live stock exchange feed. </w:t>
       </w:r>
     </w:p>
@@ -285,15 +307,30 @@
     </w:p>
     <w:p>
       <w:pPr>
+        <w:pStyle w:val="Heading4"/>
         <w:rPr>
           <w:rStyle w:val="Strong"/>
+          <w:b w:val="0"/>
+          <w:bCs w:val="0"/>
         </w:rPr>
       </w:pPr>
       <w:r>
         <w:rPr>
           <w:rStyle w:val="Strong"/>
+          <w:b w:val="0"/>
+          <w:bCs w:val="0"/>
         </w:rPr>
         <w:t>News_producer</w:t>
+      </w:r>
+    </w:p>
+    <w:p>
+      <w:r>
+        <w:rPr>
+          <w:i/>
+          <w:iCs/>
+          <w:color w:val="124F1A" w:themeColor="accent3" w:themeShade="BF"/>
+        </w:rPr>
+        <w:t>docker-compose -f docker-compose-kafka.yaml --profile producers up news-producer</w:t>
       </w:r>
     </w:p>
     <w:p>
@@ -315,7 +352,23 @@
           <w:b w:val="0"/>
           <w:bCs w:val="0"/>
         </w:rPr>
-        <w:t>Simulates a news / socual media feed</w:t>
+        <w:t>Simulates a news / soc</w:t>
+      </w:r>
+      <w:r>
+        <w:rPr>
+          <w:rStyle w:val="Strong"/>
+          <w:b w:val="0"/>
+          <w:bCs w:val="0"/>
+        </w:rPr>
+        <w:t>i</w:t>
+      </w:r>
+      <w:r>
+        <w:rPr>
+          <w:rStyle w:val="Strong"/>
+          <w:b w:val="0"/>
+          <w:bCs w:val="0"/>
+        </w:rPr>
+        <w:t>al media feed</w:t>
       </w:r>
     </w:p>
     <w:p>
@@ -350,15 +403,30 @@
     </w:p>
     <w:p>
       <w:pPr>
+        <w:pStyle w:val="Heading4"/>
         <w:rPr>
           <w:rStyle w:val="Strong"/>
+          <w:b w:val="0"/>
+          <w:bCs w:val="0"/>
         </w:rPr>
       </w:pPr>
       <w:r>
         <w:rPr>
           <w:rStyle w:val="Strong"/>
+          <w:b w:val="0"/>
+          <w:bCs w:val="0"/>
         </w:rPr>
         <w:t>Consumer_processor</w:t>
+      </w:r>
+    </w:p>
+    <w:p>
+      <w:r>
+        <w:rPr>
+          <w:i/>
+          <w:iCs/>
+          <w:color w:val="124F1A" w:themeColor="accent3" w:themeShade="BF"/>
+        </w:rPr>
+        <w:t>docker-compose -f docker-compose-kafka.yaml --profile consumers up consumer-processor</w:t>
       </w:r>
     </w:p>
     <w:p>
@@ -407,15 +475,174 @@
     </w:p>
     <w:p>
       <w:pPr>
+        <w:pStyle w:val="Heading4"/>
         <w:rPr>
           <w:rStyle w:val="Strong"/>
+          <w:b w:val="0"/>
+          <w:bCs w:val="0"/>
         </w:rPr>
       </w:pPr>
       <w:r>
         <w:rPr>
           <w:rStyle w:val="Strong"/>
+          <w:b w:val="0"/>
+          <w:bCs w:val="0"/>
         </w:rPr>
         <w:t>Consumer_sink_[stock, news]</w:t>
+      </w:r>
+    </w:p>
+    <w:p>
+      <w:pPr>
+        <w:rPr>
+          <w:i/>
+          <w:iCs/>
+          <w:color w:val="124F1A" w:themeColor="accent3" w:themeShade="BF"/>
+        </w:rPr>
+      </w:pPr>
+      <w:r>
+        <w:rPr>
+          <w:i/>
+          <w:iCs/>
+          <w:color w:val="124F1A" w:themeColor="accent3" w:themeShade="BF"/>
+        </w:rPr>
+        <w:t>docker-compose -f docker-compose-kafka.yaml --profile consumers up consumer-sink-stocks consumer-sink-news</w:t>
+      </w:r>
+    </w:p>
+    <w:p>
+      <w:pPr>
+        <w:pStyle w:val="ListParagraph"/>
+        <w:numPr>
+          <w:ilvl w:val="0"/>
+          <w:numId w:val="12"/>
+        </w:numPr>
+        <w:rPr>
+          <w:rStyle w:val="Strong"/>
+          <w:b w:val="0"/>
+          <w:bCs w:val="0"/>
+        </w:rPr>
+      </w:pPr>
+      <w:r>
+        <w:rPr>
+          <w:rStyle w:val="Strong"/>
+          <w:b w:val="0"/>
+          <w:bCs w:val="0"/>
+        </w:rPr>
+        <w:t>Data sinks, read from topics and append rows to CSV</w:t>
+      </w:r>
+      <w:r>
+        <w:rPr>
+          <w:rStyle w:val="Strong"/>
+          <w:b w:val="0"/>
+          <w:bCs w:val="0"/>
+        </w:rPr>
+        <w:t>s (disk)</w:t>
+      </w:r>
+    </w:p>
+    <w:p>
+      <w:pPr>
+        <w:pStyle w:val="Heading4"/>
+        <w:rPr>
+          <w:rStyle w:val="Strong"/>
+          <w:b w:val="0"/>
+          <w:bCs w:val="0"/>
+        </w:rPr>
+      </w:pPr>
+      <w:r>
+        <w:rPr>
+          <w:rStyle w:val="Strong"/>
+          <w:b w:val="0"/>
+          <w:bCs w:val="0"/>
+        </w:rPr>
+        <w:t>Stock-ticks</w:t>
+      </w:r>
+      <w:r>
+        <w:rPr>
+          <w:rStyle w:val="Strong"/>
+          <w:b w:val="0"/>
+          <w:bCs w:val="0"/>
+        </w:rPr>
+        <w:t>, news-posts, trade-signals</w:t>
+      </w:r>
+    </w:p>
+    <w:p>
+      <w:pPr>
+        <w:pStyle w:val="ListParagraph"/>
+        <w:numPr>
+          <w:ilvl w:val="0"/>
+          <w:numId w:val="12"/>
+        </w:numPr>
+      </w:pPr>
+      <w:r>
+        <w:t xml:space="preserve">Kafka </w:t>
+      </w:r>
+      <w:r>
+        <w:t>topic</w:t>
+      </w:r>
+      <w:r>
+        <w:t xml:space="preserve"> for stock ticks</w:t>
+      </w:r>
+    </w:p>
+    <w:p>
+      <w:pPr>
+        <w:pStyle w:val="ListParagraph"/>
+        <w:numPr>
+          <w:ilvl w:val="0"/>
+          <w:numId w:val="12"/>
+        </w:numPr>
+      </w:pPr>
+      <w:r>
+        <w:t>Persistent for 7 days</w:t>
+      </w:r>
+    </w:p>
+    <w:p>
+      <w:pPr>
+        <w:pStyle w:val="Heading3"/>
+        <w:rPr>
+          <w:rStyle w:val="Strong"/>
+          <w:b w:val="0"/>
+          <w:bCs w:val="0"/>
+        </w:rPr>
+      </w:pPr>
+      <w:r>
+        <w:rPr>
+          <w:rStyle w:val="Strong"/>
+          <w:b w:val="0"/>
+          <w:bCs w:val="0"/>
+        </w:rPr>
+        <w:t>Component Choice</w:t>
+      </w:r>
+    </w:p>
+    <w:p>
+      <w:r>
+        <w:t>Kafka was chosen because of the definition of the MC. F</w:t>
+      </w:r>
+      <w:r>
+        <w:t>u</w:t>
+      </w:r>
+      <w:r>
+        <w:t>rther more because the use case has assymetric producers and consumers. Stock ticks arrive at 10Hz but don’t need to be processed in lockstep with the slower news streams. Each consumer reads at its own pace without affecting others.</w:t>
+      </w:r>
+    </w:p>
+    <w:p>
+      <w:r>
+        <w:t>The split between processor consumer and sink consumers map to the requirement of the MC. One component that enriches / transforms data and re-inserts it, and two that persist data to disk. They can be started and stopped independently because of their seperation.</w:t>
+      </w:r>
+    </w:p>
+    <w:p>
+      <w:r>
+        <w:t>msgpack was chosen over JSON as the serializer (Bonus 1) because it is binary</w:t>
+      </w:r>
+      <w:r>
+        <w:t>, smaller per message and faster to encode/decode.</w:t>
+      </w:r>
+    </w:p>
+    <w:p>
+      <w:pPr>
+        <w:pStyle w:val="Heading2"/>
+      </w:pPr>
+      <w:r>
+        <w:lastRenderedPageBreak/>
+        <w:t>Design decisions &amp; requirements</w:t>
       </w:r>
     </w:p>
     <w:p>
@@ -425,77 +652,9 @@
           <w:ilvl w:val="0"/>
           <w:numId w:val="5"/>
         </w:numPr>
-        <w:rPr>
-          <w:rStyle w:val="Strong"/>
-          <w:b w:val="0"/>
-          <w:bCs w:val="0"/>
-        </w:rPr>
-      </w:pPr>
-      <w:r>
-        <w:rPr>
-          <w:rStyle w:val="Strong"/>
-          <w:b w:val="0"/>
-          <w:bCs w:val="0"/>
-        </w:rPr>
-        <w:t>Data sinks, read from topics and append rows to CSV</w:t>
-      </w:r>
-      <w:r>
-        <w:rPr>
-          <w:rStyle w:val="Strong"/>
-          <w:b w:val="0"/>
-          <w:bCs w:val="0"/>
-        </w:rPr>
-        <w:t>s (disk)</w:t>
-      </w:r>
-    </w:p>
-    <w:p>
-      <w:pPr>
-        <w:pStyle w:val="Heading3"/>
-        <w:rPr>
-          <w:rStyle w:val="Strong"/>
-          <w:b w:val="0"/>
-          <w:bCs w:val="0"/>
-        </w:rPr>
-      </w:pPr>
-      <w:r>
-        <w:rPr>
-          <w:rStyle w:val="Strong"/>
-          <w:b w:val="0"/>
-          <w:bCs w:val="0"/>
-        </w:rPr>
-        <w:t>Component Choice</w:t>
-      </w:r>
-    </w:p>
-    <w:p>
-      <w:r>
-        <w:t>Kafka was chosen because of the definition of the MC. F</w:t>
-      </w:r>
-      <w:r>
-        <w:t>u</w:t>
-      </w:r>
-      <w:r>
-        <w:t>rther more because the use case has assymetric producers and consumers. Stock ticks arrive at 10Hz but don’t need to be processed in lockstep with the slower news streams. Each consumer reads at its own pace without affecting others.</w:t>
-      </w:r>
-    </w:p>
-    <w:p>
-      <w:r>
-        <w:t>The split between processor consumer and sink consumers map to the requirement of the MC. One component that enriches / transforms data and re-inserts it, and two that persist data to disk. They can be started and stopped independently because of their seperation.</w:t>
-      </w:r>
-    </w:p>
-    <w:p>
-      <w:r>
-        <w:t>msgpack was chosen over JSON as the serializer (Bonus 1) because it is binary</w:t>
-      </w:r>
-      <w:r>
-        <w:t>, smaller per message and faster to encode/decode.</w:t>
-      </w:r>
-    </w:p>
-    <w:p>
-      <w:pPr>
-        <w:pStyle w:val="Heading2"/>
-      </w:pPr>
-      <w:r>
-        <w:t>Design decisions &amp; requirements</w:t>
+      </w:pPr>
+      <w:r>
+        <w:t>Put Topic names &amp; servers in a config file for reusibility</w:t>
       </w:r>
     </w:p>
     <w:p>
@@ -507,7 +666,7 @@
         </w:numPr>
       </w:pPr>
       <w:r>
-        <w:t>Put Topic names &amp; servers in a config file for reusibility</w:t>
+        <w:t>All scripts run in Jupyter container</w:t>
       </w:r>
     </w:p>
     <w:p>
@@ -519,7 +678,7 @@
         </w:numPr>
       </w:pPr>
       <w:r>
-        <w:t>All scripts run in Jupyter container</w:t>
+        <w:t>CSV sinks call flush() after every row to force immediate write to disk -&gt; no data loss if process interrupted mid-run</w:t>
       </w:r>
     </w:p>
     <w:p>
@@ -531,18 +690,6 @@
         </w:numPr>
       </w:pPr>
       <w:r>
-        <w:t>CSV sinks call flush() after every row to force immediate write to disk -&gt; no data loss if process interrupted mid-run</w:t>
-      </w:r>
-    </w:p>
-    <w:p>
-      <w:pPr>
-        <w:pStyle w:val="ListParagraph"/>
-        <w:numPr>
-          <w:ilvl w:val="0"/>
-          <w:numId w:val="5"/>
-        </w:numPr>
-      </w:pPr>
-      <w:r>
         <w:t xml:space="preserve">Libraries required: </w:t>
       </w:r>
     </w:p>
@@ -575,7 +722,6 @@
         <w:pStyle w:val="Heading2"/>
       </w:pPr>
       <w:r>
-        <w:lastRenderedPageBreak/>
         <w:t>Kafka features used</w:t>
       </w:r>
     </w:p>
@@ -617,33 +763,28 @@
     </w:p>
     <w:p>
       <w:pPr>
-        <w:pStyle w:val="Heading2"/>
-      </w:pPr>
-      <w:r>
-        <w:t>Docker Setup</w:t>
-      </w:r>
-    </w:p>
-    <w:p>
-      <w:r>
-        <w:t>No additional containers created. The scripts run on jupyter1, kafka[1,2,3] for the data stream</w:t>
-      </w:r>
-      <w:r>
-        <w:t>, and the kafdrop for the Kafdrop Webapp</w:t>
-      </w:r>
-      <w:r>
-        <w:t>. In future step maybe it is better to have one Container per consumer / producer, so it is:</w:t>
-      </w:r>
-    </w:p>
-    <w:p>
-      <w:pPr>
         <w:pStyle w:val="ListParagraph"/>
         <w:numPr>
           <w:ilvl w:val="0"/>
-          <w:numId w:val="8"/>
+          <w:numId w:val="6"/>
         </w:numPr>
       </w:pPr>
       <w:r>
-        <w:t>Easier to start &amp; stop using Docker Desktop</w:t>
+        <w:t>Offset Earliest</w:t>
+      </w:r>
+      <w:r>
+        <w:t xml:space="preserve">: </w:t>
+      </w:r>
+      <w:r>
+        <w:t xml:space="preserve">Not too much data or heavy processing in stream, so it consumer crashes, we can stream all the data in the partitions </w:t>
+      </w:r>
+    </w:p>
+    <w:p>
+      <w:pPr>
+        <w:pStyle w:val="Heading2"/>
+      </w:pPr>
+      <w:r>
+        <w:t>Docker Setup</w:t>
       </w:r>
     </w:p>
     <w:p>
@@ -651,11 +792,185 @@
         <w:pStyle w:val="ListParagraph"/>
         <w:numPr>
           <w:ilvl w:val="0"/>
-          <w:numId w:val="8"/>
+          <w:numId w:val="10"/>
         </w:numPr>
       </w:pPr>
       <w:r>
-        <w:t>Has their own dependencies (relevant in a bigger application)</w:t>
+        <w:t>docker-compose-kafka.yaml defines all services in a single file</w:t>
+      </w:r>
+    </w:p>
+    <w:p>
+      <w:pPr>
+        <w:pStyle w:val="ListParagraph"/>
+        <w:numPr>
+          <w:ilvl w:val="0"/>
+          <w:numId w:val="10"/>
+        </w:numPr>
+      </w:pPr>
+      <w:r>
+        <w:t>3 Kafka broker containers (kafka1, kafka2, kafka3)</w:t>
+      </w:r>
+      <w:r>
+        <w:t>:</w:t>
+      </w:r>
+      <w:r>
+        <w:t xml:space="preserve"> KRaft mode, no Zookeeper, replication factor 3</w:t>
+      </w:r>
+    </w:p>
+    <w:p>
+      <w:pPr>
+        <w:pStyle w:val="ListParagraph"/>
+        <w:numPr>
+          <w:ilvl w:val="0"/>
+          <w:numId w:val="10"/>
+        </w:numPr>
+      </w:pPr>
+      <w:r>
+        <w:t>Kafdrop</w:t>
+      </w:r>
+      <w:r>
+        <w:t xml:space="preserve">: </w:t>
+      </w:r>
+      <w:r>
+        <w:t>monitoring UI on port 9000</w:t>
+      </w:r>
+    </w:p>
+    <w:p>
+      <w:pPr>
+        <w:pStyle w:val="ListParagraph"/>
+        <w:numPr>
+          <w:ilvl w:val="0"/>
+          <w:numId w:val="10"/>
+        </w:numPr>
+      </w:pPr>
+      <w:r>
+        <w:t>Jupyter</w:t>
+      </w:r>
+      <w:r>
+        <w:t>:</w:t>
+      </w:r>
+      <w:r>
+        <w:t xml:space="preserve"> interactive notebook environment on port 8888, mounts notebooks/ as volume</w:t>
+      </w:r>
+      <w:r>
+        <w:t xml:space="preserve"> (not used </w:t>
+      </w:r>
+      <w:r>
+        <w:t>in my implementation)</w:t>
+      </w:r>
+    </w:p>
+    <w:p>
+      <w:pPr>
+        <w:pStyle w:val="ListParagraph"/>
+        <w:numPr>
+          <w:ilvl w:val="0"/>
+          <w:numId w:val="10"/>
+        </w:numPr>
+      </w:pPr>
+      <w:r>
+        <w:t>5 Python services built from Dockerfile.app (python:3.11-slim + kafka-python + msgpack)</w:t>
+      </w:r>
+    </w:p>
+    <w:p>
+      <w:pPr>
+        <w:pStyle w:val="ListParagraph"/>
+        <w:numPr>
+          <w:ilvl w:val="1"/>
+          <w:numId w:val="10"/>
+        </w:numPr>
+      </w:pPr>
+      <w:r>
+        <w:t>stock-producer, news-producer → profile producers</w:t>
+      </w:r>
+    </w:p>
+    <w:p>
+      <w:pPr>
+        <w:pStyle w:val="ListParagraph"/>
+        <w:numPr>
+          <w:ilvl w:val="1"/>
+          <w:numId w:val="10"/>
+        </w:numPr>
+      </w:pPr>
+      <w:r>
+        <w:t>consumer-sink-stocks, consumer-sink-news, consumer-processor → profile consumers</w:t>
+      </w:r>
+    </w:p>
+    <w:p>
+      <w:pPr>
+        <w:pStyle w:val="ListParagraph"/>
+        <w:numPr>
+          <w:ilvl w:val="0"/>
+          <w:numId w:val="10"/>
+        </w:numPr>
+      </w:pPr>
+      <w:r>
+        <w:t>Docker Compose profiles</w:t>
+      </w:r>
+      <w:r>
+        <w:t>:</w:t>
+      </w:r>
+      <w:r>
+        <w:t xml:space="preserve"> brokers always start</w:t>
+      </w:r>
+      <w:r>
+        <w:t>,</w:t>
+      </w:r>
+      <w:r>
+        <w:t xml:space="preserve"> producers/consumers started selectively with --profile producers / --profile consumers</w:t>
+      </w:r>
+    </w:p>
+    <w:p>
+      <w:pPr>
+        <w:pStyle w:val="ListParagraph"/>
+        <w:numPr>
+          <w:ilvl w:val="0"/>
+          <w:numId w:val="10"/>
+        </w:numPr>
+      </w:pPr>
+      <w:r>
+        <w:t>wait_for_kafka() in every Python service</w:t>
+      </w:r>
+      <w:r>
+        <w:t>:</w:t>
+      </w:r>
+      <w:r>
+        <w:t xml:space="preserve"> retries connection until brokers are ready, prevents crash-on-startup</w:t>
+      </w:r>
+    </w:p>
+    <w:p>
+      <w:pPr>
+        <w:pStyle w:val="ListParagraph"/>
+        <w:numPr>
+          <w:ilvl w:val="0"/>
+          <w:numId w:val="10"/>
+        </w:numPr>
+      </w:pPr>
+      <w:r>
+        <w:t>Named volume ./data:/app/data</w:t>
+      </w:r>
+      <w:r>
+        <w:t>:</w:t>
+      </w:r>
+      <w:r>
+        <w:t xml:space="preserve"> CSV sink output persisted to host filesystem</w:t>
+      </w:r>
+    </w:p>
+    <w:p>
+      <w:pPr>
+        <w:pStyle w:val="ListParagraph"/>
+        <w:numPr>
+          <w:ilvl w:val="0"/>
+          <w:numId w:val="10"/>
+        </w:numPr>
+      </w:pPr>
+      <w:r>
+        <w:t>All services on the same Docker bridge network</w:t>
+      </w:r>
+      <w:r>
+        <w:t>:</w:t>
+      </w:r>
+      <w:r>
+        <w:t xml:space="preserve"> inter-container communication via hostname (e.g. kafka1:9092)</w:t>
       </w:r>
     </w:p>
     <w:p>
@@ -663,6 +978,7 @@
         <w:pStyle w:val="Heading1"/>
       </w:pPr>
       <w:r>
+        <w:lastRenderedPageBreak/>
         <w:t>Part 2</w:t>
       </w:r>
     </w:p>
@@ -684,39 +1000,19 @@
     </w:p>
     <w:p>
       <w:pPr>
-        <w:rPr>
-          <w:b/>
-          <w:bCs/>
-        </w:rPr>
-      </w:pPr>
-      <w:r>
-        <w:rPr>
-          <w:b/>
-          <w:bCs/>
-        </w:rPr>
+        <w:pStyle w:val="Heading3"/>
+      </w:pPr>
+      <w:r>
         <w:t xml:space="preserve">Experiment </w:t>
       </w:r>
       <w:r>
-        <w:rPr>
-          <w:b/>
-          <w:bCs/>
-        </w:rPr>
         <w:t xml:space="preserve">1: </w:t>
       </w:r>
       <w:r>
-        <w:rPr>
-          <w:b/>
-          <w:bCs/>
-        </w:rPr>
         <w:t>Fan out</w:t>
       </w:r>
     </w:p>
     <w:p>
-      <w:pPr>
-        <w:rPr>
-          <w:lang w:val="en-CH"/>
-        </w:rPr>
-      </w:pPr>
       <w:r>
         <w:t>Two consumers in different groups both recei</w:t>
       </w:r>
@@ -736,198 +1032,187 @@
         <w:t xml:space="preserve">news-sink-group and </w:t>
       </w:r>
       <w:r>
-        <w:rPr>
-          <w:lang w:val="en-CH"/>
-        </w:rPr>
         <w:t>signal-processor-group</w:t>
       </w:r>
       <w:r>
-        <w:rPr>
-          <w:lang w:val="en-CH"/>
-        </w:rPr>
         <w:t xml:space="preserve"> consume </w:t>
       </w:r>
       <w:r>
-        <w:rPr>
-          <w:lang w:val="en-CH"/>
-        </w:rPr>
         <w:t xml:space="preserve">all messages </w:t>
       </w:r>
       <w:r>
-        <w:rPr>
-          <w:lang w:val="en-CH"/>
-        </w:rPr>
         <w:t>from the news-post topic)</w:t>
       </w:r>
       <w:r>
-        <w:rPr>
-          <w:lang w:val="en-CH"/>
-        </w:rPr>
         <w:t>.</w:t>
       </w:r>
     </w:p>
     <w:p>
-      <w:pPr>
-        <w:rPr>
-          <w:lang w:val="en-CH"/>
-        </w:rPr>
-      </w:pPr>
-      <w:r>
-        <w:rPr>
-          <w:lang w:val="en-CH"/>
-        </w:rPr>
+      <w:r>
         <w:t>Two different consumers (instance-1 and instance-2) will run in different consumer groups (</w:t>
       </w:r>
       <w:r>
-        <w:rPr>
-          <w:lang w:val="en-CH"/>
-        </w:rPr>
-        <w:t>group-a &amp; group-b). As expected, noth receive all data from the topic stock-ticks</w:t>
-      </w:r>
-      <w:r>
-        <w:rPr>
-          <w:lang w:val="en-CH"/>
-        </w:rPr>
+        <w:t xml:space="preserve">group-a &amp; group-b). As expected, </w:t>
+      </w:r>
+      <w:r>
+        <w:t>b</w:t>
+      </w:r>
+      <w:r>
+        <w:t>oth receive all data from the topic stock-ticks</w:t>
+      </w:r>
+      <w:r>
         <w:t>, because they consume independently from each other.</w:t>
       </w:r>
     </w:p>
-    <w:p>
-      <w:pPr>
-        <w:rPr>
-          <w:b/>
-          <w:bCs/>
-          <w:lang w:val="en-CH"/>
-        </w:rPr>
-      </w:pPr>
-      <w:r>
-        <w:rPr>
-          <w:b/>
-          <w:bCs/>
-          <w:lang w:val="en-CH"/>
-        </w:rPr>
-        <w:t>Experiment B</w:t>
-      </w:r>
-      <w:r>
-        <w:rPr>
-          <w:b/>
-          <w:bCs/>
-          <w:lang w:val="en-CH"/>
-        </w:rPr>
+    <w:p/>
+    <w:p>
+      <w:pPr>
+        <w:pStyle w:val="Heading4"/>
+      </w:pPr>
+      <w:r>
+        <w:t xml:space="preserve">Terminal 1 </w:t>
+      </w:r>
+    </w:p>
+    <w:p>
+      <w:pPr>
+        <w:rPr>
+          <w:color w:val="124F1A" w:themeColor="accent3" w:themeShade="BF"/>
+        </w:rPr>
+      </w:pPr>
+      <w:r>
+        <w:rPr>
+          <w:color w:val="124F1A" w:themeColor="accent3" w:themeShade="BF"/>
+        </w:rPr>
+        <w:t>docker exec -it jupyter1 python consumers/consumer_group_demo.py group-a instance-1</w:t>
+      </w:r>
+    </w:p>
+    <w:p>
+      <w:pPr>
+        <w:pStyle w:val="Heading4"/>
+      </w:pPr>
+      <w:r>
+        <w:t xml:space="preserve"> Terminal 2 </w:t>
+      </w:r>
+    </w:p>
+    <w:p>
+      <w:pPr>
+        <w:rPr>
+          <w:color w:val="124F1A" w:themeColor="accent3" w:themeShade="BF"/>
+        </w:rPr>
+      </w:pPr>
+      <w:r>
+        <w:rPr>
+          <w:color w:val="124F1A" w:themeColor="accent3" w:themeShade="BF"/>
+        </w:rPr>
+        <w:t>docker exec -it jupyter1 python consumers/consumer_group_demo.py group-b instance-2</w:t>
+      </w:r>
+    </w:p>
+    <w:p>
+      <w:pPr>
+        <w:pStyle w:val="Heading3"/>
+      </w:pPr>
+      <w:r>
+        <w:t xml:space="preserve">Experiment </w:t>
+      </w:r>
+      <w:r>
+        <w:t>2</w:t>
+      </w:r>
+      <w:r>
         <w:t xml:space="preserve">: </w:t>
       </w:r>
       <w:r>
-        <w:rPr>
-          <w:b/>
-          <w:bCs/>
-          <w:lang w:val="en-CH"/>
-        </w:rPr>
         <w:t>Load balancing</w:t>
       </w:r>
     </w:p>
     <w:p>
-      <w:pPr>
-        <w:rPr>
-          <w:lang w:val="en-CH"/>
-        </w:rPr>
-      </w:pPr>
-      <w:r>
-        <w:rPr>
-          <w:lang w:val="en-CH"/>
-        </w:rPr>
+      <w:r>
         <w:t xml:space="preserve">Now </w:t>
       </w:r>
       <w:r>
-        <w:rPr>
-          <w:lang w:val="en-CH"/>
-        </w:rPr>
         <w:t>2 consumers</w:t>
       </w:r>
       <w:r>
-        <w:rPr>
-          <w:lang w:val="en-CH"/>
-        </w:rPr>
-        <w:t xml:space="preserve"> </w:t>
-      </w:r>
-      <w:r>
-        <w:rPr>
-          <w:lang w:val="en-CH"/>
-        </w:rPr>
-        <w:t>(instance-1 and instance-2)</w:t>
-      </w:r>
-      <w:r>
-        <w:rPr>
-          <w:lang w:val="en-CH"/>
-        </w:rPr>
+        <w:t xml:space="preserve"> (instance-1 and instance-2)</w:t>
+      </w:r>
+      <w:r>
         <w:t xml:space="preserve"> will run in tha same group</w:t>
       </w:r>
       <w:r>
-        <w:rPr>
-          <w:lang w:val="en-CH"/>
-        </w:rPr>
-        <w:t xml:space="preserve"> </w:t>
-      </w:r>
-      <w:r>
-        <w:rPr>
-          <w:lang w:val="en-CH"/>
-        </w:rPr>
-        <w:t>(group-a</w:t>
-      </w:r>
-      <w:r>
-        <w:rPr>
-          <w:lang w:val="en-CH"/>
-        </w:rPr>
-        <w:t>)</w:t>
-      </w:r>
-      <w:r>
-        <w:rPr>
-          <w:lang w:val="en-CH"/>
-        </w:rPr>
+        <w:t xml:space="preserve"> (group-a)</w:t>
+      </w:r>
+      <w:r>
         <w:t xml:space="preserve"> consuming messages from the same sink.</w:t>
       </w:r>
     </w:p>
     <w:p>
-      <w:pPr>
-        <w:rPr>
-          <w:lang w:val="en-CH"/>
-        </w:rPr>
-      </w:pPr>
-      <w:r>
-        <w:rPr>
-          <w:lang w:val="en-CH"/>
-        </w:rPr>
+      <w:r>
         <w:t>The output shows</w:t>
       </w:r>
       <w:r>
-        <w:rPr>
-          <w:lang w:val="en-CH"/>
-        </w:rPr>
         <w:t>, that if 1 consumer is running, the other is blocked. The maximum parall</w:t>
       </w:r>
       <w:r>
-        <w:rPr>
-          <w:lang w:val="en-CH"/>
-        </w:rPr>
         <w:t>elism within a consumer group is limitted by the number of partitions. Since there is only 1 partition in the stock-tick topic, only 1 consumer can receive all messages at the same time.</w:t>
       </w:r>
     </w:p>
     <w:p>
-      <w:pPr>
-        <w:rPr>
-          <w:lang w:val="en-CH"/>
-        </w:rPr>
-      </w:pPr>
-      <w:r>
-        <w:rPr>
-          <w:lang w:val="en-CH"/>
-        </w:rPr>
+      <w:r>
+        <w:t>Since we have 1 partition, we cannot demonstrate load balancing effectively. The purpose of having 2 consumers in 1 group is so th</w:t>
+      </w:r>
+      <w:r>
+        <w:t xml:space="preserve">e consumers withing the group can process data from different partitions </w:t>
+      </w:r>
+      <w:r>
+        <w:t>(same topic). This L</w:t>
+      </w:r>
+      <w:r>
+        <w:t xml:space="preserve">oad balancing can be effective, when used with partitioning, which we will discuss </w:t>
+      </w:r>
+      <w:r>
+        <w:t>in the following section.</w:t>
+      </w:r>
+    </w:p>
+    <w:p>
+      <w:pPr>
+        <w:pStyle w:val="Heading4"/>
+      </w:pPr>
+      <w:r>
+        <w:t>Terminal 1</w:t>
+      </w:r>
+    </w:p>
+    <w:p>
+      <w:pPr>
+        <w:rPr>
+          <w:color w:val="124F1A" w:themeColor="accent3" w:themeShade="BF"/>
+        </w:rPr>
+      </w:pPr>
+      <w:r>
+        <w:rPr>
+          <w:color w:val="124F1A" w:themeColor="accent3" w:themeShade="BF"/>
+        </w:rPr>
+        <w:t>docker exec -it jupyter1 python consumers/consumer_group_demo.py group-a instance-1</w:t>
+      </w:r>
+    </w:p>
+    <w:p>
+      <w:pPr>
+        <w:pStyle w:val="Heading4"/>
+      </w:pPr>
+      <w:r>
         <w:lastRenderedPageBreak/>
-        <w:t xml:space="preserve">Load balancing can be effective, when used with partitioning, which we will discuss </w:t>
-      </w:r>
-      <w:r>
-        <w:rPr>
-          <w:lang w:val="en-CH"/>
-        </w:rPr>
-        <w:t>in the followiung section.</w:t>
+        <w:t>Terminal 2</w:t>
+      </w:r>
+    </w:p>
+    <w:p>
+      <w:pPr>
+        <w:rPr>
+          <w:color w:val="124F1A" w:themeColor="accent3" w:themeShade="BF"/>
+        </w:rPr>
+      </w:pPr>
+      <w:r>
+        <w:rPr>
+          <w:color w:val="124F1A" w:themeColor="accent3" w:themeShade="BF"/>
+        </w:rPr>
+        <w:t>docker exec -it jupyter1 python consumers/consumer_group_demo.py group-a instance-2</w:t>
       </w:r>
     </w:p>
     <w:p>
@@ -1055,16 +1340,7 @@
           </w:tcPr>
           <w:p>
             <w:r>
-              <w:t>stock-ticks-p</w:t>
-            </w:r>
-            <w:r>
-              <w:t>3</w:t>
-            </w:r>
-            <w:r>
-              <w:t>-r</w:t>
-            </w:r>
-            <w:r>
-              <w:t>1</w:t>
+              <w:t>stock-ticks-p3-r1</w:t>
             </w:r>
           </w:p>
         </w:tc>
@@ -1106,16 +1382,7 @@
           </w:tcPr>
           <w:p>
             <w:r>
-              <w:t>stock-ticks-p</w:t>
-            </w:r>
-            <w:r>
-              <w:t>3</w:t>
-            </w:r>
-            <w:r>
-              <w:t>-r</w:t>
-            </w:r>
-            <w:r>
-              <w:t>3</w:t>
+              <w:t>stock-ticks-p3-r3</w:t>
             </w:r>
           </w:p>
         </w:tc>
@@ -1154,6 +1421,51 @@
     <w:p/>
     <w:p>
       <w:pPr>
+        <w:pStyle w:val="Heading4"/>
+      </w:pPr>
+      <w:r>
+        <w:t>Terminal</w:t>
+      </w:r>
+    </w:p>
+    <w:p>
+      <w:pPr>
+        <w:rPr>
+          <w:color w:val="124F1A" w:themeColor="accent3" w:themeShade="BF"/>
+        </w:rPr>
+      </w:pPr>
+      <w:r>
+        <w:rPr>
+          <w:color w:val="124F1A" w:themeColor="accent3" w:themeShade="BF"/>
+        </w:rPr>
+        <w:t>docker exec -it jupyter1 python consumers/setup_topics.py</w:t>
+      </w:r>
+    </w:p>
+    <w:p>
+      <w:pPr>
+        <w:pStyle w:val="Heading3"/>
+      </w:pPr>
+      <w:r>
+        <w:t>Partition details</w:t>
+      </w:r>
+    </w:p>
+    <w:p>
+      <w:r>
+        <w:t xml:space="preserve">The details </w:t>
+      </w:r>
+      <w:r>
+        <w:t>show information about the topic. To note is the Leader Node for further experiments. This is assigned by kafka automatically across brokers. This partition contains the active stream of messages published by the producer, the others are synchronized replications of the leader node.</w:t>
+      </w:r>
+    </w:p>
+    <w:p>
+      <w:pPr>
+        <w:pStyle w:val="Heading4"/>
+      </w:pPr>
+      <w:r>
+        <w:t>stock-ticks-p1-r1</w:t>
+      </w:r>
+    </w:p>
+    <w:p>
+      <w:pPr>
         <w:rPr>
           <w:b/>
           <w:bCs/>
@@ -1163,34 +1475,7 @@
         <w:rPr>
           <w:b/>
           <w:bCs/>
-        </w:rPr>
-        <w:t>Partition details</w:t>
-      </w:r>
-    </w:p>
-    <w:p>
-      <w:pPr>
-        <w:rPr>
-          <w:lang w:val="en-CH"/>
-        </w:rPr>
-      </w:pPr>
-      <w:r>
-        <w:rPr>
-          <w:lang w:val="en-CH"/>
-        </w:rPr>
-        <w:t>stock-ticks-p1-r1</w:t>
-      </w:r>
-    </w:p>
-    <w:p>
-      <w:pPr>
-        <w:rPr>
-          <w:b/>
-          <w:bCs/>
-        </w:rPr>
-      </w:pPr>
-      <w:r>
-        <w:rPr>
-          <w:b/>
-          <w:bCs/>
+          <w:noProof/>
         </w:rPr>
         <w:drawing>
           <wp:inline distT="0" distB="0" distL="0" distR="0" wp14:anchorId="081BA450" wp14:editId="466D3F83">
@@ -1231,14 +1516,9 @@
     </w:p>
     <w:p>
       <w:pPr>
-        <w:rPr>
-          <w:lang w:val="en-CH"/>
-        </w:rPr>
-      </w:pPr>
-      <w:r>
-        <w:rPr>
-          <w:lang w:val="en-CH"/>
-        </w:rPr>
+        <w:pStyle w:val="Heading4"/>
+      </w:pPr>
+      <w:r>
         <w:t>stock-ticks-p3-r1</w:t>
       </w:r>
     </w:p>
@@ -1253,6 +1533,7 @@
         <w:rPr>
           <w:b/>
           <w:bCs/>
+          <w:noProof/>
         </w:rPr>
         <w:drawing>
           <wp:inline distT="0" distB="0" distL="0" distR="0" wp14:anchorId="7F8D079F" wp14:editId="6152B3AE">
@@ -1293,14 +1574,10 @@
     </w:p>
     <w:p>
       <w:pPr>
-        <w:rPr>
-          <w:lang w:val="en-CH"/>
-        </w:rPr>
-      </w:pPr>
-      <w:r>
-        <w:rPr>
-          <w:lang w:val="en-CH"/>
-        </w:rPr>
+        <w:pStyle w:val="Heading4"/>
+      </w:pPr>
+      <w:r>
+        <w:lastRenderedPageBreak/>
         <w:t>stock-ticks-p3-r3</w:t>
       </w:r>
     </w:p>
@@ -1315,6 +1592,7 @@
         <w:rPr>
           <w:b/>
           <w:bCs/>
+          <w:noProof/>
         </w:rPr>
         <w:drawing>
           <wp:inline distT="0" distB="0" distL="0" distR="0" wp14:anchorId="09D8818C" wp14:editId="06DF7D0C">
@@ -1354,15 +1632,144 @@
       </w:r>
     </w:p>
     <w:p>
-      <w:r>
-        <w:lastRenderedPageBreak/>
-        <w:t xml:space="preserve">The details </w:t>
-      </w:r>
-      <w:r>
-        <w:t>show information about the topic. To note is the Leader Node for further experiments. This is assigned by kafka</w:t>
-      </w:r>
-      <w:r>
-        <w:t xml:space="preserve"> automatically across brokers</w:t>
+      <w:pPr>
+        <w:pStyle w:val="Heading3"/>
+      </w:pPr>
+      <w:r>
+        <w:t>Experiment 1:</w:t>
+      </w:r>
+      <w:r>
+        <w:t xml:space="preserve"> Partition Parallelism</w:t>
+      </w:r>
+    </w:p>
+    <w:p>
+      <w:r>
+        <w:t>3 consumers run in the same group against</w:t>
+      </w:r>
+      <w:r>
+        <w:t xml:space="preserve"> topic stock-ticks-p3-r3. Each consumer </w:t>
+      </w:r>
+      <w:r>
+        <w:t>gets assigned one partition.</w:t>
+      </w:r>
+      <w:r>
+        <w:t xml:space="preserve"> Because the consumers in the same group are assigned to </w:t>
+      </w:r>
+      <w:r>
+        <w:t xml:space="preserve">different partitions, they can all consume messages and process in parallel. Comparing this to the </w:t>
+      </w:r>
+      <w:r>
+        <w:rPr>
+          <w:i/>
+          <w:iCs/>
+        </w:rPr>
+        <w:t>Experiment 2: Load balancing</w:t>
+      </w:r>
+      <w:r>
+        <w:rPr>
+          <w:i/>
+          <w:iCs/>
+        </w:rPr>
+        <w:t xml:space="preserve"> </w:t>
+      </w:r>
+      <w:r>
+        <w:t>from earlier, we see that load balancing works.</w:t>
+      </w:r>
+    </w:p>
+    <w:p>
+      <w:pPr>
+        <w:rPr>
+          <w:rStyle w:val="Heading4Char"/>
+        </w:rPr>
+      </w:pPr>
+      <w:r>
+        <w:rPr>
+          <w:rStyle w:val="Heading4Char"/>
+        </w:rPr>
+        <w:t>Terminal 1</w:t>
+      </w:r>
+      <w:r>
+        <w:rPr>
+          <w:rStyle w:val="Heading4Char"/>
+        </w:rPr>
+        <w:t xml:space="preserve">: </w:t>
+      </w:r>
+      <w:r>
+        <w:rPr>
+          <w:rStyle w:val="Heading4Char"/>
+        </w:rPr>
+        <w:t xml:space="preserve"> producer </w:t>
+      </w:r>
+    </w:p>
+    <w:p>
+      <w:pPr>
+        <w:rPr>
+          <w:color w:val="196B24" w:themeColor="accent3"/>
+        </w:rPr>
+      </w:pPr>
+      <w:r>
+        <w:rPr>
+          <w:color w:val="196B24" w:themeColor="accent3"/>
+        </w:rPr>
+        <w:t xml:space="preserve">docker exec -it jupyter1 python </w:t>
+      </w:r>
+      <w:r>
+        <w:rPr>
+          <w:color w:val="196B24" w:themeColor="accent3"/>
+        </w:rPr>
+        <w:t xml:space="preserve">producers/producer_experiment.py stock-ticks-p3-r3 </w:t>
+      </w:r>
+    </w:p>
+    <w:p>
+      <w:pPr>
+        <w:rPr>
+          <w:rStyle w:val="Heading4Char"/>
+        </w:rPr>
+      </w:pPr>
+      <w:r>
+        <w:rPr>
+          <w:rStyle w:val="Heading4Char"/>
+        </w:rPr>
+        <w:t xml:space="preserve">Terminal 2,3,4: 3 consumers in same group </w:t>
+      </w:r>
+    </w:p>
+    <w:p>
+      <w:pPr>
+        <w:rPr>
+          <w:color w:val="196B24" w:themeColor="accent3"/>
+        </w:rPr>
+      </w:pPr>
+      <w:r>
+        <w:rPr>
+          <w:color w:val="196B24" w:themeColor="accent3"/>
+        </w:rPr>
+        <w:t xml:space="preserve">docker exec -it jupyter1 python consumers/consumer_group_demo.py group-p3 inst-1 stock-ticks-p3-r3 </w:t>
+      </w:r>
+    </w:p>
+    <w:p>
+      <w:pPr>
+        <w:rPr>
+          <w:color w:val="196B24" w:themeColor="accent3"/>
+        </w:rPr>
+      </w:pPr>
+      <w:r>
+        <w:rPr>
+          <w:color w:val="196B24" w:themeColor="accent3"/>
+        </w:rPr>
+        <w:t xml:space="preserve">docker exec -it jupyter1 python consumers/consumer_group_demo.py group-p3 inst-2 stock-ticks-p3-r3 </w:t>
+      </w:r>
+    </w:p>
+    <w:p>
+      <w:pPr>
+        <w:rPr>
+          <w:color w:val="196B24" w:themeColor="accent3"/>
+        </w:rPr>
+      </w:pPr>
+      <w:r>
+        <w:rPr>
+          <w:color w:val="196B24" w:themeColor="accent3"/>
+        </w:rPr>
+        <w:t>docker exec -it jupyter1 python consumers/consumer_group_demo.py group-p3 inst-3 stock-ticks-p3-r3</w:t>
       </w:r>
     </w:p>
     <w:p>
@@ -1372,68 +1779,36 @@
           <w:bCs/>
         </w:rPr>
       </w:pPr>
-      <w:r>
-        <w:rPr>
-          <w:b/>
-          <w:bCs/>
-        </w:rPr>
-        <w:t xml:space="preserve">Experiment 1: </w:t>
-      </w:r>
-      <w:r>
-        <w:rPr>
-          <w:b/>
-          <w:bCs/>
-        </w:rPr>
-        <w:t>O</w:t>
-      </w:r>
-      <w:r>
-        <w:rPr>
-          <w:b/>
-          <w:bCs/>
-        </w:rPr>
-        <w:t>bserve topic layouts in Kafdrop</w:t>
-      </w:r>
-    </w:p>
-    <w:p>
-      <w:r>
-        <w:t>Partition</w:t>
-      </w:r>
-    </w:p>
-    <w:p>
-      <w:pPr>
-        <w:rPr>
-          <w:b/>
-          <w:bCs/>
-        </w:rPr>
-      </w:pPr>
-    </w:p>
-    <w:p>
-      <w:pPr>
-        <w:rPr>
-          <w:b/>
-          <w:bCs/>
-        </w:rPr>
-      </w:pPr>
-      <w:r>
-        <w:rPr>
-          <w:b/>
-          <w:bCs/>
-        </w:rPr>
-        <w:t xml:space="preserve">Experiment 2: </w:t>
-      </w:r>
-      <w:r>
-        <w:rPr>
-          <w:b/>
-          <w:bCs/>
-        </w:rPr>
-        <w:t>K</w:t>
-      </w:r>
-      <w:r>
-        <w:rPr>
-          <w:b/>
-          <w:bCs/>
-        </w:rPr>
-        <w:t>ill a broker, observe fault tolerance</w:t>
+    </w:p>
+    <w:p>
+      <w:pPr>
+        <w:pStyle w:val="Heading3"/>
+      </w:pPr>
+      <w:r>
+        <w:t>Experiment 2:</w:t>
+      </w:r>
+      <w:r>
+        <w:t xml:space="preserve"> </w:t>
+      </w:r>
+      <w:r>
+        <w:t>Broker failure &amp; replication</w:t>
+      </w:r>
+      <w:r>
+        <w:t xml:space="preserve"> (TODO)</w:t>
+      </w:r>
+    </w:p>
+    <w:p/>
+    <w:p>
+      <w:pPr>
+        <w:rPr>
+          <w:rFonts w:asciiTheme="majorHAnsi" w:eastAsiaTheme="majorEastAsia" w:hAnsiTheme="majorHAnsi" w:cstheme="majorBidi"/>
+          <w:color w:val="0F4761" w:themeColor="accent1" w:themeShade="BF"/>
+          <w:sz w:val="40"/>
+          <w:szCs w:val="40"/>
+        </w:rPr>
+      </w:pPr>
+      <w:r>
+        <w:br w:type="page"/>
       </w:r>
     </w:p>
     <w:p>
@@ -1441,10 +1816,715 @@
         <w:pStyle w:val="Heading1"/>
       </w:pPr>
       <w:r>
+        <w:lastRenderedPageBreak/>
         <w:t>Part 3</w:t>
       </w:r>
     </w:p>
+    <w:p>
+      <w:pPr>
+        <w:pStyle w:val="Heading2"/>
+      </w:pPr>
+      <w:r>
+        <w:rPr>
+          <w:lang w:val="en-US"/>
+        </w:rPr>
+        <w:t>Architecture &amp; Design overview</w:t>
+      </w:r>
+    </w:p>
+    <w:p>
+      <w:pPr>
+        <w:rPr>
+          <w:lang w:val="en-CH"/>
+        </w:rPr>
+      </w:pPr>
+      <w:r>
+        <w:rPr>
+          <w:lang w:val="en-CH"/>
+        </w:rPr>
+        <w:drawing>
+          <wp:inline distT="0" distB="0" distL="0" distR="0" wp14:anchorId="011247B1" wp14:editId="45076524">
+            <wp:extent cx="5191125" cy="3903404"/>
+            <wp:effectExtent l="0" t="0" r="0" b="0"/>
+            <wp:docPr id="516741406" name="Picture 2"/>
+            <wp:cNvGraphicFramePr>
+              <a:graphicFrameLocks xmlns:a="http://schemas.openxmlformats.org/drawingml/2006/main" noChangeAspect="1"/>
+            </wp:cNvGraphicFramePr>
+            <a:graphic xmlns:a="http://schemas.openxmlformats.org/drawingml/2006/main">
+              <a:graphicData uri="http://schemas.openxmlformats.org/drawingml/2006/picture">
+                <pic:pic xmlns:pic="http://schemas.openxmlformats.org/drawingml/2006/picture">
+                  <pic:nvPicPr>
+                    <pic:cNvPr id="0" name="Picture 6"/>
+                    <pic:cNvPicPr>
+                      <a:picLocks noChangeAspect="1" noChangeArrowheads="1"/>
+                    </pic:cNvPicPr>
+                  </pic:nvPicPr>
+                  <pic:blipFill>
+                    <a:blip r:embed="rId9" cstate="print">
+                      <a:extLst>
+                        <a:ext uri="{28A0092B-C50C-407E-A947-70E740481C1C}">
+                          <a14:useLocalDpi xmlns:a14="http://schemas.microsoft.com/office/drawing/2010/main" val="0"/>
+                        </a:ext>
+                      </a:extLst>
+                    </a:blip>
+                    <a:srcRect/>
+                    <a:stretch>
+                      <a:fillRect/>
+                    </a:stretch>
+                  </pic:blipFill>
+                  <pic:spPr bwMode="auto">
+                    <a:xfrm>
+                      <a:off x="0" y="0"/>
+                      <a:ext cx="5198578" cy="3909008"/>
+                    </a:xfrm>
+                    <a:prstGeom prst="rect">
+                      <a:avLst/>
+                    </a:prstGeom>
+                    <a:noFill/>
+                    <a:ln>
+                      <a:noFill/>
+                    </a:ln>
+                  </pic:spPr>
+                </pic:pic>
+              </a:graphicData>
+            </a:graphic>
+          </wp:inline>
+        </w:drawing>
+      </w:r>
+    </w:p>
+    <w:p>
+      <w:pPr>
+        <w:rPr>
+          <w:lang w:val="en-CH"/>
+        </w:rPr>
+      </w:pPr>
+      <w:r>
+        <w:rPr>
+          <w:lang w:val="en-CH"/>
+        </w:rPr>
+        <w:t>The stock producer publishes 10 messages per second to the stock-ticks fanout exchange. Because there is only one consumer for stock ticks (sink_stocks), there is exactly one bound queue (stock-ticks-sink)</w:t>
+      </w:r>
+      <w:r>
+        <w:rPr>
+          <w:lang w:val="en-CH"/>
+        </w:rPr>
+        <w:t>, therefore this exchange could also have the type topic</w:t>
+      </w:r>
+      <w:r>
+        <w:rPr>
+          <w:lang w:val="en-CH"/>
+        </w:rPr>
+        <w:t xml:space="preserve"> instead of fanout</w:t>
+      </w:r>
+      <w:r>
+        <w:rPr>
+          <w:lang w:val="en-CH"/>
+        </w:rPr>
+        <w:t>. The exchange copies every message into that queue, and sink_stocks pulls each one, appends a row to CSV, and calls basic_ack. Once acknowledged, the message is deleted.</w:t>
+      </w:r>
+    </w:p>
+    <w:p>
+      <w:pPr>
+        <w:rPr>
+          <w:lang w:val="en-CH"/>
+        </w:rPr>
+      </w:pPr>
+      <w:r>
+        <w:rPr>
+          <w:lang w:val="en-CH"/>
+        </w:rPr>
+        <w:t xml:space="preserve">The news producer publishes 1 message per second to news-posts. This exchange has </w:t>
+      </w:r>
+      <w:r>
+        <w:rPr>
+          <w:i/>
+          <w:iCs/>
+          <w:lang w:val="en-CH"/>
+        </w:rPr>
+        <w:t>2</w:t>
+      </w:r>
+      <w:r>
+        <w:rPr>
+          <w:lang w:val="en-CH"/>
+        </w:rPr>
+        <w:t xml:space="preserve"> bound queues</w:t>
+      </w:r>
+      <w:r>
+        <w:rPr>
+          <w:lang w:val="en-CH"/>
+        </w:rPr>
+        <w:t xml:space="preserve">: </w:t>
+      </w:r>
+      <w:r>
+        <w:rPr>
+          <w:lang w:val="en-CH"/>
+        </w:rPr>
+        <w:t>news-posts-sink and news-posts-processor. The fanout exchange copies every news message into both simultaneously. This is what enables the sink and the processor to each receive the full stream independently, without any coordination. sink_news writes to CSV; the processor reads the same message, derives a BUY/SELL signal, and publishes it to the trade-signals exchange. From there it lands in whatever queue is bound to that exchange (extensible for any downstream consumer).</w:t>
+      </w:r>
+    </w:p>
+    <w:p>
+      <w:pPr>
+        <w:pStyle w:val="Heading2"/>
+        <w:rPr>
+          <w:lang w:val="en-CH"/>
+        </w:rPr>
+      </w:pPr>
+      <w:r>
+        <w:rPr>
+          <w:lang w:val="en-CH"/>
+        </w:rPr>
+        <w:lastRenderedPageBreak/>
+        <w:t>Communication patterns</w:t>
+      </w:r>
+    </w:p>
+    <w:p>
+      <w:pPr>
+        <w:pStyle w:val="Heading3"/>
+        <w:rPr>
+          <w:lang w:val="en-CH"/>
+        </w:rPr>
+      </w:pPr>
+      <w:r>
+        <w:rPr>
+          <w:lang w:val="en-CH"/>
+        </w:rPr>
+        <w:t>Why are they similar</w:t>
+      </w:r>
+    </w:p>
+    <w:p>
+      <w:r>
+        <w:t>Both are broker-based pub/sub systems: producers and consumers don't know about each other, multiple consumers can receive the same stream independently, and both support message persistence and delivery acknowledgment. The business logic in Parts 1 and 3 is nearly identical</w:t>
+      </w:r>
+      <w:r>
+        <w:t xml:space="preserve">, </w:t>
+      </w:r>
+      <w:r>
+        <w:t>only the broker API changed.</w:t>
+      </w:r>
+    </w:p>
+    <w:p>
+      <w:pPr>
+        <w:pStyle w:val="Heading2"/>
+        <w:rPr>
+          <w:lang w:val="en-CH"/>
+        </w:rPr>
+      </w:pPr>
+      <w:r>
+        <w:rPr>
+          <w:lang w:val="en-CH"/>
+        </w:rPr>
+        <w:t>Core Differences</w:t>
+      </w:r>
+    </w:p>
+    <w:p>
+      <w:pPr>
+        <w:rPr>
+          <w:lang w:val="en-CH"/>
+        </w:rPr>
+      </w:pPr>
+      <w:r>
+        <w:rPr>
+          <w:lang w:val="en-CH"/>
+        </w:rPr>
+        <w:t>Kafka is meant for stream processing. It enables high throughput of messages</w:t>
+      </w:r>
+      <w:r>
+        <w:rPr>
+          <w:lang w:val="en-CH"/>
+        </w:rPr>
+        <w:t xml:space="preserve"> and is by design fan</w:t>
+      </w:r>
+      <w:r>
+        <w:rPr>
+          <w:lang w:val="en-CH"/>
+        </w:rPr>
+        <w:t>-out</w:t>
+      </w:r>
+      <w:r>
+        <w:rPr>
+          <w:lang w:val="en-CH"/>
+        </w:rPr>
+        <w:t>.</w:t>
+      </w:r>
+      <w:r>
+        <w:rPr>
+          <w:lang w:val="en-CH"/>
+        </w:rPr>
+        <w:t xml:space="preserve"> Meanwhile RabbitMQ is a traditional message queue system</w:t>
+      </w:r>
+      <w:r>
+        <w:rPr>
+          <w:lang w:val="en-CH"/>
+        </w:rPr>
+        <w:t xml:space="preserve"> ideal for moderate data volumes</w:t>
+      </w:r>
+      <w:r>
+        <w:rPr>
+          <w:lang w:val="en-CH"/>
+        </w:rPr>
+        <w:t>.</w:t>
+      </w:r>
+      <w:r>
+        <w:rPr>
+          <w:lang w:val="en-CH"/>
+        </w:rPr>
+        <w:t xml:space="preserve"> We can see in the architecture for RabbitMQ, had to create seperate queues for the processor and the sink_news</w:t>
+      </w:r>
+      <w:r>
+        <w:rPr>
+          <w:lang w:val="en-CH"/>
+        </w:rPr>
+        <w:t>, whereas in the kafka architecture the consumers consume the messages from the same topic.</w:t>
+      </w:r>
+      <w:r>
+        <w:rPr>
+          <w:lang w:val="en-CH"/>
+        </w:rPr>
+        <w:t xml:space="preserve"> </w:t>
+      </w:r>
+    </w:p>
+    <w:p>
+      <w:pPr>
+        <w:rPr>
+          <w:lang w:val="en-CH"/>
+        </w:rPr>
+      </w:pPr>
+      <w:r>
+        <w:rPr>
+          <w:lang w:val="en-CH"/>
+        </w:rPr>
+        <w:t>RabbitMQ</w:t>
+      </w:r>
+      <w:r>
+        <w:rPr>
+          <w:lang w:val="en-CH"/>
+        </w:rPr>
+        <w:t xml:space="preserve"> enables complex message routing, where messages are intended for one specific consumer</w:t>
+      </w:r>
+      <w:r>
+        <w:rPr>
+          <w:lang w:val="en-CH"/>
+        </w:rPr>
+        <w:t>.</w:t>
+      </w:r>
+    </w:p>
+    <w:p>
+      <w:pPr>
+        <w:rPr>
+          <w:lang w:val="en-CH"/>
+        </w:rPr>
+      </w:pPr>
+      <w:r>
+        <w:rPr>
+          <w:lang w:val="en-CH"/>
+        </w:rPr>
+        <w:t>Kafka is a distributed commit log. Messages are written to disk and stay there regardless of whether anyone has read them. Consumers track their own position (offset) in the log and can replay history by resetting it. The broker is passive storage.</w:t>
+      </w:r>
+    </w:p>
+    <w:p>
+      <w:pPr>
+        <w:rPr>
+          <w:lang w:val="en-CH"/>
+        </w:rPr>
+      </w:pPr>
+      <w:r>
+        <w:rPr>
+          <w:lang w:val="en-CH"/>
+        </w:rPr>
+        <w:t>RabbitMQ is a message queue. A message exists until one consumer acknowledges it, then it's deleted forever. There's no offset, no log, no replay. The broker actively pushes messages to consumers and handles all routing logic.</w:t>
+      </w:r>
+    </w:p>
+    <w:p>
+      <w:pPr>
+        <w:rPr>
+          <w:lang w:val="en-CH"/>
+        </w:rPr>
+      </w:pPr>
+      <w:r>
+        <w:rPr>
+          <w:lang w:val="en-CH"/>
+        </w:rPr>
+        <w:t xml:space="preserve">In Kafka the message routing is done by the producer. </w:t>
+      </w:r>
+      <w:r>
+        <w:rPr>
+          <w:lang w:val="en-CH"/>
+        </w:rPr>
+        <w:t>The producers define the properties of messages, which define their route</w:t>
+      </w:r>
+      <w:r>
+        <w:rPr>
+          <w:lang w:val="en-CH"/>
+        </w:rPr>
+        <w:t xml:space="preserve"> (including which partition).</w:t>
+      </w:r>
+      <w:r>
+        <w:rPr>
+          <w:lang w:val="en-CH"/>
+        </w:rPr>
+        <w:t xml:space="preserve"> In RabbitMQ the routing happens in the exchange.</w:t>
+      </w:r>
+      <w:r>
+        <w:rPr>
+          <w:lang w:val="en-CH"/>
+        </w:rPr>
+        <w:t xml:space="preserve"> The exchange routs messages based on properties of the queues. These exchanges can also be used to duplicate messages in </w:t>
+      </w:r>
+      <w:r>
+        <w:rPr>
+          <w:lang w:val="en-CH"/>
+        </w:rPr>
+        <w:t xml:space="preserve">multiple </w:t>
+      </w:r>
+      <w:r>
+        <w:rPr>
+          <w:lang w:val="en-CH"/>
+        </w:rPr>
+        <w:t>queues</w:t>
+      </w:r>
+      <w:r>
+        <w:rPr>
+          <w:lang w:val="en-CH"/>
+        </w:rPr>
+        <w:t>, simulating kafkas built in fan</w:t>
+      </w:r>
+      <w:r>
+        <w:rPr>
+          <w:lang w:val="en-CH"/>
+        </w:rPr>
+        <w:t>-out approach (like I did).</w:t>
+      </w:r>
+    </w:p>
+    <w:p>
+      <w:pPr>
+        <w:pStyle w:val="Heading3"/>
+      </w:pPr>
+      <w:r>
+        <w:t>Known Issues</w:t>
+      </w:r>
+      <w:r>
+        <w:t xml:space="preserve"> (TODO)</w:t>
+      </w:r>
+    </w:p>
     <w:p/>
+    <w:p>
+      <w:pPr>
+        <w:pStyle w:val="Heading2"/>
+        <w:rPr>
+          <w:lang w:val="en-CH"/>
+        </w:rPr>
+      </w:pPr>
+      <w:r>
+        <w:rPr>
+          <w:lang w:val="en-CH"/>
+        </w:rPr>
+        <w:t>Scalability</w:t>
+      </w:r>
+    </w:p>
+    <w:p>
+      <w:pPr>
+        <w:rPr>
+          <w:lang w:val="en-CH"/>
+        </w:rPr>
+      </w:pPr>
+      <w:r>
+        <w:rPr>
+          <w:lang w:val="en-CH"/>
+        </w:rPr>
+        <w:t xml:space="preserve">Kafka scales by adding brokers and increasing partition counts. More partitions = more parallel consumers. </w:t>
+      </w:r>
+      <w:r>
+        <w:rPr>
+          <w:lang w:val="en-CH"/>
+        </w:rPr>
+        <w:t>My</w:t>
+      </w:r>
+      <w:r>
+        <w:rPr>
+          <w:lang w:val="en-CH"/>
+        </w:rPr>
+        <w:t xml:space="preserve"> 3-broker setup already tolerates one broker failure with no data loss. To handle 10</w:t>
+      </w:r>
+      <w:r>
+        <w:rPr>
+          <w:lang w:val="en-CH"/>
+        </w:rPr>
+        <w:t>x</w:t>
+      </w:r>
+      <w:r>
+        <w:rPr>
+          <w:lang w:val="en-CH"/>
+        </w:rPr>
+        <w:t xml:space="preserve"> more stock ticks</w:t>
+      </w:r>
+      <w:r>
+        <w:rPr>
+          <w:lang w:val="en-CH"/>
+        </w:rPr>
+        <w:t>, I have to</w:t>
+      </w:r>
+      <w:r>
+        <w:rPr>
+          <w:lang w:val="en-CH"/>
+        </w:rPr>
+        <w:t xml:space="preserve"> create the topic with 10 partitions, run 10 sink instances. The main challenge is planning partition counts upfront, since reducing them later is not </w:t>
+      </w:r>
+      <w:r>
+        <w:rPr>
+          <w:lang w:val="en-CH"/>
+        </w:rPr>
+        <w:t>ideal</w:t>
+      </w:r>
+      <w:r>
+        <w:rPr>
+          <w:lang w:val="en-CH"/>
+        </w:rPr>
+        <w:t>.</w:t>
+      </w:r>
+    </w:p>
+    <w:p>
+      <w:pPr>
+        <w:rPr>
+          <w:lang w:val="en-CH"/>
+        </w:rPr>
+      </w:pPr>
+      <w:r>
+        <w:rPr>
+          <w:lang w:val="en-CH"/>
+        </w:rPr>
+        <w:lastRenderedPageBreak/>
+        <w:t xml:space="preserve">RabbitMQ scales consumer throughput easily </w:t>
+      </w:r>
+      <w:r>
+        <w:rPr>
+          <w:lang w:val="en-CH"/>
+        </w:rPr>
+        <w:t>by</w:t>
+      </w:r>
+      <w:r>
+        <w:rPr>
+          <w:lang w:val="en-CH"/>
+        </w:rPr>
+        <w:t xml:space="preserve"> add</w:t>
+      </w:r>
+      <w:r>
+        <w:rPr>
+          <w:lang w:val="en-CH"/>
+        </w:rPr>
+        <w:t>ing</w:t>
+      </w:r>
+      <w:r>
+        <w:rPr>
+          <w:lang w:val="en-CH"/>
+        </w:rPr>
+        <w:t xml:space="preserve"> more consumers to the same queue and the broker round-robins delivery automatically, no configuration needed. Scaling the broker itself is harder: all messages for one queue pass through one process on one node, so there's no clean equivalent to Kafka's "add a partition." The workarounds (</w:t>
+      </w:r>
+      <w:r>
+        <w:rPr>
+          <w:lang w:val="en-CH"/>
+        </w:rPr>
+        <w:t xml:space="preserve">e.g. </w:t>
+      </w:r>
+      <w:r>
+        <w:rPr>
+          <w:lang w:val="en-CH"/>
+        </w:rPr>
+        <w:t>queue sharding) are significantly more complex.</w:t>
+      </w:r>
+    </w:p>
+    <w:p>
+      <w:pPr>
+        <w:rPr>
+          <w:lang w:val="en-CH"/>
+        </w:rPr>
+      </w:pPr>
+      <w:r>
+        <w:rPr>
+          <w:lang w:val="en-CH"/>
+        </w:rPr>
+        <w:t xml:space="preserve">For this application </w:t>
+      </w:r>
+      <w:r>
+        <w:rPr>
+          <w:lang w:val="en-CH"/>
+        </w:rPr>
+        <w:t>(</w:t>
+      </w:r>
+      <w:r>
+        <w:rPr>
+          <w:lang w:val="en-CH"/>
+        </w:rPr>
+        <w:t>11 messages/s</w:t>
+      </w:r>
+      <w:r>
+        <w:rPr>
+          <w:lang w:val="en-CH"/>
+        </w:rPr>
+        <w:t xml:space="preserve">) </w:t>
+      </w:r>
+      <w:r>
+        <w:rPr>
+          <w:lang w:val="en-CH"/>
+        </w:rPr>
+        <w:t>RabbitMQ is more than sufficient and far simpler to run. Kafka becomes the better choice if the system scaled to hundreds of symbols with real market feeds, where replay and high throughput would matt</w:t>
+      </w:r>
+      <w:r>
+        <w:rPr>
+          <w:lang w:val="en-CH"/>
+        </w:rPr>
+        <w:t>er.</w:t>
+      </w:r>
+    </w:p>
+    <w:p>
+      <w:pPr>
+        <w:pStyle w:val="Heading1"/>
+        <w:rPr>
+          <w:lang w:val="en-CH"/>
+        </w:rPr>
+      </w:pPr>
+      <w:r>
+        <w:rPr>
+          <w:lang w:val="en-CH"/>
+        </w:rPr>
+        <w:t>Part 4</w:t>
+      </w:r>
+    </w:p>
+    <w:p>
+      <w:pPr>
+        <w:pStyle w:val="Heading2"/>
+        <w:rPr>
+          <w:lang w:val="en-CH"/>
+        </w:rPr>
+      </w:pPr>
+      <w:r>
+        <w:rPr>
+          <w:lang w:val="en-CH"/>
+        </w:rPr>
+        <w:t>Setup</w:t>
+      </w:r>
+    </w:p>
+    <w:p>
+      <w:pPr>
+        <w:rPr>
+          <w:lang w:val="en-CH"/>
+        </w:rPr>
+      </w:pPr>
+      <w:r>
+        <w:rPr>
+          <w:lang w:val="en-CH"/>
+        </w:rPr>
+        <w:t>Three profiling scripts were written and executed. Each measures a different component in isolation:</w:t>
+      </w:r>
+    </w:p>
+    <w:p>
+      <w:pPr>
+        <w:pStyle w:val="ListParagraph"/>
+        <w:numPr>
+          <w:ilvl w:val="0"/>
+          <w:numId w:val="14"/>
+        </w:numPr>
+        <w:rPr>
+          <w:lang w:val="en-CH"/>
+        </w:rPr>
+      </w:pPr>
+      <w:r>
+        <w:rPr>
+          <w:lang w:val="en-CH"/>
+        </w:rPr>
+        <w:t>profile_stock_producer.py</w:t>
+      </w:r>
+      <w:r>
+        <w:rPr>
+          <w:lang w:val="en-CH"/>
+        </w:rPr>
+        <w:t>:</w:t>
+      </w:r>
+      <w:r>
+        <w:rPr>
+          <w:lang w:val="en-CH"/>
+        </w:rPr>
+        <w:t xml:space="preserve"> Kafka stock producer, 5 runs × 500 messages</w:t>
+      </w:r>
+    </w:p>
+    <w:p>
+      <w:pPr>
+        <w:pStyle w:val="ListParagraph"/>
+        <w:numPr>
+          <w:ilvl w:val="0"/>
+          <w:numId w:val="14"/>
+        </w:numPr>
+        <w:rPr>
+          <w:lang w:val="en-CH"/>
+        </w:rPr>
+      </w:pPr>
+      <w:r>
+        <w:rPr>
+          <w:lang w:val="en-CH"/>
+        </w:rPr>
+        <w:t>profile_stock_producer_rmq.py</w:t>
+      </w:r>
+      <w:r>
+        <w:rPr>
+          <w:lang w:val="en-CH"/>
+        </w:rPr>
+        <w:t>:</w:t>
+      </w:r>
+      <w:r>
+        <w:rPr>
+          <w:lang w:val="en-CH"/>
+        </w:rPr>
+        <w:t xml:space="preserve"> RabbitMQ stock producer, 5 runs × 500 messages</w:t>
+      </w:r>
+    </w:p>
+    <w:p>
+      <w:pPr>
+        <w:pStyle w:val="ListParagraph"/>
+        <w:numPr>
+          <w:ilvl w:val="0"/>
+          <w:numId w:val="14"/>
+        </w:numPr>
+        <w:rPr>
+          <w:lang w:val="en-CH"/>
+        </w:rPr>
+      </w:pPr>
+      <w:r>
+        <w:rPr>
+          <w:lang w:val="en-CH"/>
+        </w:rPr>
+        <w:t>profile_consumer_sink.py</w:t>
+      </w:r>
+      <w:r>
+        <w:rPr>
+          <w:lang w:val="en-CH"/>
+        </w:rPr>
+        <w:t>:</w:t>
+      </w:r>
+      <w:r>
+        <w:rPr>
+          <w:lang w:val="en-CH"/>
+        </w:rPr>
+        <w:t xml:space="preserve"> consumer deserialization loop, 10000 iterations, msgpack vs JSON</w:t>
+      </w:r>
+    </w:p>
+    <w:p>
+      <w:pPr>
+        <w:rPr>
+          <w:lang w:val="en-CH"/>
+        </w:rPr>
+      </w:pPr>
+      <w:r>
+        <w:rPr>
+          <w:lang w:val="en-CH"/>
+        </w:rPr>
+        <w:t>All timing is captured with time.perf_counter() per loop iteration. cProfile was used to generate .prof files visualized with SnakeViz.</w:t>
+      </w:r>
+    </w:p>
+    <w:p>
+      <w:pPr>
+        <w:rPr>
+          <w:lang w:val="en-CH"/>
+        </w:rPr>
+      </w:pPr>
+    </w:p>
     <w:sectPr>
       <w:pgSz w:w="11906" w:h="16838"/>
       <w:pgMar w:top="1440" w:right="1440" w:bottom="1440" w:left="1440" w:header="708" w:footer="708" w:gutter="0"/>
@@ -1458,6 +2538,268 @@
 <file path=word/numbering.xml><?xml version="1.0" encoding="utf-8"?>
 <w:numbering xmlns:wpc="http://schemas.microsoft.com/office/word/2010/wordprocessingCanvas" xmlns:cx="http://schemas.microsoft.com/office/drawing/2014/chartex" xmlns:cx1="http://schemas.microsoft.com/office/drawing/2015/9/8/chartex" xmlns:cx2="http://schemas.microsoft.com/office/drawing/2015/10/21/chartex" xmlns:cx3="http://schemas.microsoft.com/office/drawing/2016/5/9/chartex" xmlns:cx4="http://schemas.microsoft.com/office/drawing/2016/5/10/chartex" xmlns:cx5="http://schemas.microsoft.com/office/drawing/2016/5/11/chartex" xmlns:cx6="http://schemas.microsoft.com/office/drawing/2016/5/12/chartex" xmlns:cx7="http://schemas.microsoft.com/office/drawing/2016/5/13/chartex" xmlns:cx8="http://schemas.microsoft.com/office/drawing/2016/5/14/chartex" xmlns:mc="http://schemas.openxmlformats.org/markup-compatibility/2006" xmlns:aink="http://schemas.microsoft.com/office/drawing/2016/ink" xmlns:am3d="http://schemas.microsoft.com/office/drawing/2017/model3d" xmlns:o="urn:schemas-microsoft-com:office:office" xmlns:oel="http://schemas.microsoft.com/office/2019/extlst" xmlns:r="http://schemas.openxmlformats.org/officeDocument/2006/relationships" xmlns:m="http://schemas.openxmlformats.org/officeDocument/2006/math" xmlns:v="urn:schemas-microsoft-com:vml" xmlns:wp14="http://schemas.microsoft.com/office/word/2010/wordprocessingDrawing" xmlns:wp="http://schemas.openxmlformats.org/drawingml/2006/wordprocessingDrawing" xmlns:w10="urn:schemas-microsoft-com:office:word" xmlns:w="http://schemas.openxmlformats.org/wordprocessingml/2006/main" xmlns:w14="http://schemas.microsoft.com/office/word/2010/wordml" xmlns:w15="http://schemas.microsoft.com/office/word/2012/wordml" xmlns:w16cex="http://schemas.microsoft.com/office/word/2018/wordml/cex" xmlns:w16cid="http://schemas.microsoft.com/office/word/2016/wordml/cid" xmlns:w16="http://schemas.microsoft.com/office/word/2018/wordml" xmlns:w16du="http://schemas.microsoft.com/office/word/2023/wordml/word16du" xmlns:w16sdtdh="http://schemas.microsoft.com/office/word/2020/wordml/sdtdatahash" xmlns:w16sdtfl="http://schemas.microsoft.com/office/word/2024/wordml/sdtformatlock" xmlns:w16se="http://schemas.microsoft.com/office/word/2015/wordml/symex" xmlns:wpg="http://schemas.microsoft.com/office/word/2010/wordprocessingGroup" xmlns:wpi="http://schemas.microsoft.com/office/word/2010/wordprocessingInk" xmlns:wne="http://schemas.microsoft.com/office/word/2006/wordml" xmlns:wps="http://schemas.microsoft.com/office/word/2010/wordprocessingShape" mc:Ignorable="w14 w15 w16se w16cid w16 w16cex w16sdtdh w16sdtfl w16du wp14">
   <w:abstractNum w:abstractNumId="0" w15:restartNumberingAfterBreak="0">
+    <w:nsid w:val="0ADD7F82"/>
+    <w:multiLevelType w:val="hybridMultilevel"/>
+    <w:tmpl w:val="8B4C50C4"/>
+    <w:lvl w:ilvl="0" w:tplc="20000001">
+      <w:start w:val="1"/>
+      <w:numFmt w:val="bullet"/>
+      <w:lvlText w:val=""/>
+      <w:lvlJc w:val="left"/>
+      <w:pPr>
+        <w:ind w:left="720" w:hanging="360"/>
+      </w:pPr>
+      <w:rPr>
+        <w:rFonts w:ascii="Symbol" w:hAnsi="Symbol" w:hint="default"/>
+      </w:rPr>
+    </w:lvl>
+    <w:lvl w:ilvl="1" w:tplc="20000003" w:tentative="1">
+      <w:start w:val="1"/>
+      <w:numFmt w:val="bullet"/>
+      <w:lvlText w:val="o"/>
+      <w:lvlJc w:val="left"/>
+      <w:pPr>
+        <w:ind w:left="1440" w:hanging="360"/>
+      </w:pPr>
+      <w:rPr>
+        <w:rFonts w:ascii="Courier New" w:hAnsi="Courier New" w:cs="Courier New" w:hint="default"/>
+      </w:rPr>
+    </w:lvl>
+    <w:lvl w:ilvl="2" w:tplc="20000005" w:tentative="1">
+      <w:start w:val="1"/>
+      <w:numFmt w:val="bullet"/>
+      <w:lvlText w:val=""/>
+      <w:lvlJc w:val="left"/>
+      <w:pPr>
+        <w:ind w:left="2160" w:hanging="360"/>
+      </w:pPr>
+      <w:rPr>
+        <w:rFonts w:ascii="Wingdings" w:hAnsi="Wingdings" w:hint="default"/>
+      </w:rPr>
+    </w:lvl>
+    <w:lvl w:ilvl="3" w:tplc="20000001" w:tentative="1">
+      <w:start w:val="1"/>
+      <w:numFmt w:val="bullet"/>
+      <w:lvlText w:val=""/>
+      <w:lvlJc w:val="left"/>
+      <w:pPr>
+        <w:ind w:left="2880" w:hanging="360"/>
+      </w:pPr>
+      <w:rPr>
+        <w:rFonts w:ascii="Symbol" w:hAnsi="Symbol" w:hint="default"/>
+      </w:rPr>
+    </w:lvl>
+    <w:lvl w:ilvl="4" w:tplc="20000003" w:tentative="1">
+      <w:start w:val="1"/>
+      <w:numFmt w:val="bullet"/>
+      <w:lvlText w:val="o"/>
+      <w:lvlJc w:val="left"/>
+      <w:pPr>
+        <w:ind w:left="3600" w:hanging="360"/>
+      </w:pPr>
+      <w:rPr>
+        <w:rFonts w:ascii="Courier New" w:hAnsi="Courier New" w:cs="Courier New" w:hint="default"/>
+      </w:rPr>
+    </w:lvl>
+    <w:lvl w:ilvl="5" w:tplc="20000005" w:tentative="1">
+      <w:start w:val="1"/>
+      <w:numFmt w:val="bullet"/>
+      <w:lvlText w:val=""/>
+      <w:lvlJc w:val="left"/>
+      <w:pPr>
+        <w:ind w:left="4320" w:hanging="360"/>
+      </w:pPr>
+      <w:rPr>
+        <w:rFonts w:ascii="Wingdings" w:hAnsi="Wingdings" w:hint="default"/>
+      </w:rPr>
+    </w:lvl>
+    <w:lvl w:ilvl="6" w:tplc="20000001" w:tentative="1">
+      <w:start w:val="1"/>
+      <w:numFmt w:val="bullet"/>
+      <w:lvlText w:val=""/>
+      <w:lvlJc w:val="left"/>
+      <w:pPr>
+        <w:ind w:left="5040" w:hanging="360"/>
+      </w:pPr>
+      <w:rPr>
+        <w:rFonts w:ascii="Symbol" w:hAnsi="Symbol" w:hint="default"/>
+      </w:rPr>
+    </w:lvl>
+    <w:lvl w:ilvl="7" w:tplc="20000003" w:tentative="1">
+      <w:start w:val="1"/>
+      <w:numFmt w:val="bullet"/>
+      <w:lvlText w:val="o"/>
+      <w:lvlJc w:val="left"/>
+      <w:pPr>
+        <w:ind w:left="5760" w:hanging="360"/>
+      </w:pPr>
+      <w:rPr>
+        <w:rFonts w:ascii="Courier New" w:hAnsi="Courier New" w:cs="Courier New" w:hint="default"/>
+      </w:rPr>
+    </w:lvl>
+    <w:lvl w:ilvl="8" w:tplc="20000005" w:tentative="1">
+      <w:start w:val="1"/>
+      <w:numFmt w:val="bullet"/>
+      <w:lvlText w:val=""/>
+      <w:lvlJc w:val="left"/>
+      <w:pPr>
+        <w:ind w:left="6480" w:hanging="360"/>
+      </w:pPr>
+      <w:rPr>
+        <w:rFonts w:ascii="Wingdings" w:hAnsi="Wingdings" w:hint="default"/>
+      </w:rPr>
+    </w:lvl>
+  </w:abstractNum>
+  <w:abstractNum w:abstractNumId="1" w15:restartNumberingAfterBreak="0">
+    <w:nsid w:val="147C1E08"/>
+    <w:multiLevelType w:val="multilevel"/>
+    <w:tmpl w:val="C550252C"/>
+    <w:lvl w:ilvl="0">
+      <w:start w:val="1"/>
+      <w:numFmt w:val="bullet"/>
+      <w:lvlText w:val=""/>
+      <w:lvlJc w:val="left"/>
+      <w:pPr>
+        <w:tabs>
+          <w:tab w:val="num" w:pos="720"/>
+        </w:tabs>
+        <w:ind w:left="720" w:hanging="360"/>
+      </w:pPr>
+      <w:rPr>
+        <w:rFonts w:ascii="Symbol" w:hAnsi="Symbol" w:hint="default"/>
+        <w:sz w:val="20"/>
+      </w:rPr>
+    </w:lvl>
+    <w:lvl w:ilvl="1">
+      <w:start w:val="1"/>
+      <w:numFmt w:val="bullet"/>
+      <w:lvlText w:val="o"/>
+      <w:lvlJc w:val="left"/>
+      <w:pPr>
+        <w:tabs>
+          <w:tab w:val="num" w:pos="1440"/>
+        </w:tabs>
+        <w:ind w:left="1440" w:hanging="360"/>
+      </w:pPr>
+      <w:rPr>
+        <w:rFonts w:ascii="Courier New" w:hAnsi="Courier New" w:hint="default"/>
+        <w:sz w:val="20"/>
+      </w:rPr>
+    </w:lvl>
+    <w:lvl w:ilvl="2" w:tentative="1">
+      <w:start w:val="1"/>
+      <w:numFmt w:val="bullet"/>
+      <w:lvlText w:val=""/>
+      <w:lvlJc w:val="left"/>
+      <w:pPr>
+        <w:tabs>
+          <w:tab w:val="num" w:pos="2160"/>
+        </w:tabs>
+        <w:ind w:left="2160" w:hanging="360"/>
+      </w:pPr>
+      <w:rPr>
+        <w:rFonts w:ascii="Wingdings" w:hAnsi="Wingdings" w:hint="default"/>
+        <w:sz w:val="20"/>
+      </w:rPr>
+    </w:lvl>
+    <w:lvl w:ilvl="3" w:tentative="1">
+      <w:start w:val="1"/>
+      <w:numFmt w:val="bullet"/>
+      <w:lvlText w:val=""/>
+      <w:lvlJc w:val="left"/>
+      <w:pPr>
+        <w:tabs>
+          <w:tab w:val="num" w:pos="2880"/>
+        </w:tabs>
+        <w:ind w:left="2880" w:hanging="360"/>
+      </w:pPr>
+      <w:rPr>
+        <w:rFonts w:ascii="Wingdings" w:hAnsi="Wingdings" w:hint="default"/>
+        <w:sz w:val="20"/>
+      </w:rPr>
+    </w:lvl>
+    <w:lvl w:ilvl="4" w:tentative="1">
+      <w:start w:val="1"/>
+      <w:numFmt w:val="bullet"/>
+      <w:lvlText w:val=""/>
+      <w:lvlJc w:val="left"/>
+      <w:pPr>
+        <w:tabs>
+          <w:tab w:val="num" w:pos="3600"/>
+        </w:tabs>
+        <w:ind w:left="3600" w:hanging="360"/>
+      </w:pPr>
+      <w:rPr>
+        <w:rFonts w:ascii="Wingdings" w:hAnsi="Wingdings" w:hint="default"/>
+        <w:sz w:val="20"/>
+      </w:rPr>
+    </w:lvl>
+    <w:lvl w:ilvl="5" w:tentative="1">
+      <w:start w:val="1"/>
+      <w:numFmt w:val="bullet"/>
+      <w:lvlText w:val=""/>
+      <w:lvlJc w:val="left"/>
+      <w:pPr>
+        <w:tabs>
+          <w:tab w:val="num" w:pos="4320"/>
+        </w:tabs>
+        <w:ind w:left="4320" w:hanging="360"/>
+      </w:pPr>
+      <w:rPr>
+        <w:rFonts w:ascii="Wingdings" w:hAnsi="Wingdings" w:hint="default"/>
+        <w:sz w:val="20"/>
+      </w:rPr>
+    </w:lvl>
+    <w:lvl w:ilvl="6" w:tentative="1">
+      <w:start w:val="1"/>
+      <w:numFmt w:val="bullet"/>
+      <w:lvlText w:val=""/>
+      <w:lvlJc w:val="left"/>
+      <w:pPr>
+        <w:tabs>
+          <w:tab w:val="num" w:pos="5040"/>
+        </w:tabs>
+        <w:ind w:left="5040" w:hanging="360"/>
+      </w:pPr>
+      <w:rPr>
+        <w:rFonts w:ascii="Wingdings" w:hAnsi="Wingdings" w:hint="default"/>
+        <w:sz w:val="20"/>
+      </w:rPr>
+    </w:lvl>
+    <w:lvl w:ilvl="7" w:tentative="1">
+      <w:start w:val="1"/>
+      <w:numFmt w:val="bullet"/>
+      <w:lvlText w:val=""/>
+      <w:lvlJc w:val="left"/>
+      <w:pPr>
+        <w:tabs>
+          <w:tab w:val="num" w:pos="5760"/>
+        </w:tabs>
+        <w:ind w:left="5760" w:hanging="360"/>
+      </w:pPr>
+      <w:rPr>
+        <w:rFonts w:ascii="Wingdings" w:hAnsi="Wingdings" w:hint="default"/>
+        <w:sz w:val="20"/>
+      </w:rPr>
+    </w:lvl>
+    <w:lvl w:ilvl="8" w:tentative="1">
+      <w:start w:val="1"/>
+      <w:numFmt w:val="bullet"/>
+      <w:lvlText w:val=""/>
+      <w:lvlJc w:val="left"/>
+      <w:pPr>
+        <w:tabs>
+          <w:tab w:val="num" w:pos="6480"/>
+        </w:tabs>
+        <w:ind w:left="6480" w:hanging="360"/>
+      </w:pPr>
+      <w:rPr>
+        <w:rFonts w:ascii="Wingdings" w:hAnsi="Wingdings" w:hint="default"/>
+        <w:sz w:val="20"/>
+      </w:rPr>
+    </w:lvl>
+  </w:abstractNum>
+  <w:abstractNum w:abstractNumId="2" w15:restartNumberingAfterBreak="0">
     <w:nsid w:val="1499639B"/>
     <w:multiLevelType w:val="hybridMultilevel"/>
     <w:tmpl w:val="66CAEFC4"/>
@@ -1570,7 +2912,7 @@
       </w:rPr>
     </w:lvl>
   </w:abstractNum>
-  <w:abstractNum w:abstractNumId="1" w15:restartNumberingAfterBreak="0">
+  <w:abstractNum w:abstractNumId="3" w15:restartNumberingAfterBreak="0">
     <w:nsid w:val="18703624"/>
     <w:multiLevelType w:val="hybridMultilevel"/>
     <w:tmpl w:val="8F6EE760"/>
@@ -1683,7 +3025,7 @@
       </w:rPr>
     </w:lvl>
   </w:abstractNum>
-  <w:abstractNum w:abstractNumId="2" w15:restartNumberingAfterBreak="0">
+  <w:abstractNum w:abstractNumId="4" w15:restartNumberingAfterBreak="0">
     <w:nsid w:val="1AA3242F"/>
     <w:multiLevelType w:val="hybridMultilevel"/>
     <w:tmpl w:val="BF4694AC"/>
@@ -1796,7 +3138,156 @@
       </w:rPr>
     </w:lvl>
   </w:abstractNum>
-  <w:abstractNum w:abstractNumId="3" w15:restartNumberingAfterBreak="0">
+  <w:abstractNum w:abstractNumId="5" w15:restartNumberingAfterBreak="0">
+    <w:nsid w:val="1C964F71"/>
+    <w:multiLevelType w:val="multilevel"/>
+    <w:tmpl w:val="DA4C50CC"/>
+    <w:lvl w:ilvl="0">
+      <w:start w:val="1"/>
+      <w:numFmt w:val="bullet"/>
+      <w:lvlText w:val=""/>
+      <w:lvlJc w:val="left"/>
+      <w:pPr>
+        <w:tabs>
+          <w:tab w:val="num" w:pos="720"/>
+        </w:tabs>
+        <w:ind w:left="720" w:hanging="360"/>
+      </w:pPr>
+      <w:rPr>
+        <w:rFonts w:ascii="Symbol" w:hAnsi="Symbol" w:hint="default"/>
+        <w:sz w:val="20"/>
+      </w:rPr>
+    </w:lvl>
+    <w:lvl w:ilvl="1" w:tentative="1">
+      <w:start w:val="1"/>
+      <w:numFmt w:val="bullet"/>
+      <w:lvlText w:val="o"/>
+      <w:lvlJc w:val="left"/>
+      <w:pPr>
+        <w:tabs>
+          <w:tab w:val="num" w:pos="1440"/>
+        </w:tabs>
+        <w:ind w:left="1440" w:hanging="360"/>
+      </w:pPr>
+      <w:rPr>
+        <w:rFonts w:ascii="Courier New" w:hAnsi="Courier New" w:hint="default"/>
+        <w:sz w:val="20"/>
+      </w:rPr>
+    </w:lvl>
+    <w:lvl w:ilvl="2" w:tentative="1">
+      <w:start w:val="1"/>
+      <w:numFmt w:val="bullet"/>
+      <w:lvlText w:val=""/>
+      <w:lvlJc w:val="left"/>
+      <w:pPr>
+        <w:tabs>
+          <w:tab w:val="num" w:pos="2160"/>
+        </w:tabs>
+        <w:ind w:left="2160" w:hanging="360"/>
+      </w:pPr>
+      <w:rPr>
+        <w:rFonts w:ascii="Wingdings" w:hAnsi="Wingdings" w:hint="default"/>
+        <w:sz w:val="20"/>
+      </w:rPr>
+    </w:lvl>
+    <w:lvl w:ilvl="3" w:tentative="1">
+      <w:start w:val="1"/>
+      <w:numFmt w:val="bullet"/>
+      <w:lvlText w:val=""/>
+      <w:lvlJc w:val="left"/>
+      <w:pPr>
+        <w:tabs>
+          <w:tab w:val="num" w:pos="2880"/>
+        </w:tabs>
+        <w:ind w:left="2880" w:hanging="360"/>
+      </w:pPr>
+      <w:rPr>
+        <w:rFonts w:ascii="Wingdings" w:hAnsi="Wingdings" w:hint="default"/>
+        <w:sz w:val="20"/>
+      </w:rPr>
+    </w:lvl>
+    <w:lvl w:ilvl="4" w:tentative="1">
+      <w:start w:val="1"/>
+      <w:numFmt w:val="bullet"/>
+      <w:lvlText w:val=""/>
+      <w:lvlJc w:val="left"/>
+      <w:pPr>
+        <w:tabs>
+          <w:tab w:val="num" w:pos="3600"/>
+        </w:tabs>
+        <w:ind w:left="3600" w:hanging="360"/>
+      </w:pPr>
+      <w:rPr>
+        <w:rFonts w:ascii="Wingdings" w:hAnsi="Wingdings" w:hint="default"/>
+        <w:sz w:val="20"/>
+      </w:rPr>
+    </w:lvl>
+    <w:lvl w:ilvl="5" w:tentative="1">
+      <w:start w:val="1"/>
+      <w:numFmt w:val="bullet"/>
+      <w:lvlText w:val=""/>
+      <w:lvlJc w:val="left"/>
+      <w:pPr>
+        <w:tabs>
+          <w:tab w:val="num" w:pos="4320"/>
+        </w:tabs>
+        <w:ind w:left="4320" w:hanging="360"/>
+      </w:pPr>
+      <w:rPr>
+        <w:rFonts w:ascii="Wingdings" w:hAnsi="Wingdings" w:hint="default"/>
+        <w:sz w:val="20"/>
+      </w:rPr>
+    </w:lvl>
+    <w:lvl w:ilvl="6" w:tentative="1">
+      <w:start w:val="1"/>
+      <w:numFmt w:val="bullet"/>
+      <w:lvlText w:val=""/>
+      <w:lvlJc w:val="left"/>
+      <w:pPr>
+        <w:tabs>
+          <w:tab w:val="num" w:pos="5040"/>
+        </w:tabs>
+        <w:ind w:left="5040" w:hanging="360"/>
+      </w:pPr>
+      <w:rPr>
+        <w:rFonts w:ascii="Wingdings" w:hAnsi="Wingdings" w:hint="default"/>
+        <w:sz w:val="20"/>
+      </w:rPr>
+    </w:lvl>
+    <w:lvl w:ilvl="7" w:tentative="1">
+      <w:start w:val="1"/>
+      <w:numFmt w:val="bullet"/>
+      <w:lvlText w:val=""/>
+      <w:lvlJc w:val="left"/>
+      <w:pPr>
+        <w:tabs>
+          <w:tab w:val="num" w:pos="5760"/>
+        </w:tabs>
+        <w:ind w:left="5760" w:hanging="360"/>
+      </w:pPr>
+      <w:rPr>
+        <w:rFonts w:ascii="Wingdings" w:hAnsi="Wingdings" w:hint="default"/>
+        <w:sz w:val="20"/>
+      </w:rPr>
+    </w:lvl>
+    <w:lvl w:ilvl="8" w:tentative="1">
+      <w:start w:val="1"/>
+      <w:numFmt w:val="bullet"/>
+      <w:lvlText w:val=""/>
+      <w:lvlJc w:val="left"/>
+      <w:pPr>
+        <w:tabs>
+          <w:tab w:val="num" w:pos="6480"/>
+        </w:tabs>
+        <w:ind w:left="6480" w:hanging="360"/>
+      </w:pPr>
+      <w:rPr>
+        <w:rFonts w:ascii="Wingdings" w:hAnsi="Wingdings" w:hint="default"/>
+        <w:sz w:val="20"/>
+      </w:rPr>
+    </w:lvl>
+  </w:abstractNum>
+  <w:abstractNum w:abstractNumId="6" w15:restartNumberingAfterBreak="0">
     <w:nsid w:val="212D612F"/>
     <w:multiLevelType w:val="hybridMultilevel"/>
     <w:tmpl w:val="D2A0E314"/>
@@ -1909,7 +3400,120 @@
       </w:rPr>
     </w:lvl>
   </w:abstractNum>
-  <w:abstractNum w:abstractNumId="4" w15:restartNumberingAfterBreak="0">
+  <w:abstractNum w:abstractNumId="7" w15:restartNumberingAfterBreak="0">
+    <w:nsid w:val="3E1A2FFF"/>
+    <w:multiLevelType w:val="hybridMultilevel"/>
+    <w:tmpl w:val="EBACA7B0"/>
+    <w:lvl w:ilvl="0" w:tplc="20000001">
+      <w:start w:val="1"/>
+      <w:numFmt w:val="bullet"/>
+      <w:lvlText w:val=""/>
+      <w:lvlJc w:val="left"/>
+      <w:pPr>
+        <w:ind w:left="720" w:hanging="360"/>
+      </w:pPr>
+      <w:rPr>
+        <w:rFonts w:ascii="Symbol" w:hAnsi="Symbol" w:hint="default"/>
+      </w:rPr>
+    </w:lvl>
+    <w:lvl w:ilvl="1" w:tplc="20000003">
+      <w:start w:val="1"/>
+      <w:numFmt w:val="bullet"/>
+      <w:lvlText w:val="o"/>
+      <w:lvlJc w:val="left"/>
+      <w:pPr>
+        <w:ind w:left="1440" w:hanging="360"/>
+      </w:pPr>
+      <w:rPr>
+        <w:rFonts w:ascii="Courier New" w:hAnsi="Courier New" w:cs="Courier New" w:hint="default"/>
+      </w:rPr>
+    </w:lvl>
+    <w:lvl w:ilvl="2" w:tplc="20000005" w:tentative="1">
+      <w:start w:val="1"/>
+      <w:numFmt w:val="bullet"/>
+      <w:lvlText w:val=""/>
+      <w:lvlJc w:val="left"/>
+      <w:pPr>
+        <w:ind w:left="2160" w:hanging="360"/>
+      </w:pPr>
+      <w:rPr>
+        <w:rFonts w:ascii="Wingdings" w:hAnsi="Wingdings" w:hint="default"/>
+      </w:rPr>
+    </w:lvl>
+    <w:lvl w:ilvl="3" w:tplc="20000001" w:tentative="1">
+      <w:start w:val="1"/>
+      <w:numFmt w:val="bullet"/>
+      <w:lvlText w:val=""/>
+      <w:lvlJc w:val="left"/>
+      <w:pPr>
+        <w:ind w:left="2880" w:hanging="360"/>
+      </w:pPr>
+      <w:rPr>
+        <w:rFonts w:ascii="Symbol" w:hAnsi="Symbol" w:hint="default"/>
+      </w:rPr>
+    </w:lvl>
+    <w:lvl w:ilvl="4" w:tplc="20000003" w:tentative="1">
+      <w:start w:val="1"/>
+      <w:numFmt w:val="bullet"/>
+      <w:lvlText w:val="o"/>
+      <w:lvlJc w:val="left"/>
+      <w:pPr>
+        <w:ind w:left="3600" w:hanging="360"/>
+      </w:pPr>
+      <w:rPr>
+        <w:rFonts w:ascii="Courier New" w:hAnsi="Courier New" w:cs="Courier New" w:hint="default"/>
+      </w:rPr>
+    </w:lvl>
+    <w:lvl w:ilvl="5" w:tplc="20000005" w:tentative="1">
+      <w:start w:val="1"/>
+      <w:numFmt w:val="bullet"/>
+      <w:lvlText w:val=""/>
+      <w:lvlJc w:val="left"/>
+      <w:pPr>
+        <w:ind w:left="4320" w:hanging="360"/>
+      </w:pPr>
+      <w:rPr>
+        <w:rFonts w:ascii="Wingdings" w:hAnsi="Wingdings" w:hint="default"/>
+      </w:rPr>
+    </w:lvl>
+    <w:lvl w:ilvl="6" w:tplc="20000001" w:tentative="1">
+      <w:start w:val="1"/>
+      <w:numFmt w:val="bullet"/>
+      <w:lvlText w:val=""/>
+      <w:lvlJc w:val="left"/>
+      <w:pPr>
+        <w:ind w:left="5040" w:hanging="360"/>
+      </w:pPr>
+      <w:rPr>
+        <w:rFonts w:ascii="Symbol" w:hAnsi="Symbol" w:hint="default"/>
+      </w:rPr>
+    </w:lvl>
+    <w:lvl w:ilvl="7" w:tplc="20000003" w:tentative="1">
+      <w:start w:val="1"/>
+      <w:numFmt w:val="bullet"/>
+      <w:lvlText w:val="o"/>
+      <w:lvlJc w:val="left"/>
+      <w:pPr>
+        <w:ind w:left="5760" w:hanging="360"/>
+      </w:pPr>
+      <w:rPr>
+        <w:rFonts w:ascii="Courier New" w:hAnsi="Courier New" w:cs="Courier New" w:hint="default"/>
+      </w:rPr>
+    </w:lvl>
+    <w:lvl w:ilvl="8" w:tplc="20000005" w:tentative="1">
+      <w:start w:val="1"/>
+      <w:numFmt w:val="bullet"/>
+      <w:lvlText w:val=""/>
+      <w:lvlJc w:val="left"/>
+      <w:pPr>
+        <w:ind w:left="6480" w:hanging="360"/>
+      </w:pPr>
+      <w:rPr>
+        <w:rFonts w:ascii="Wingdings" w:hAnsi="Wingdings" w:hint="default"/>
+      </w:rPr>
+    </w:lvl>
+  </w:abstractNum>
+  <w:abstractNum w:abstractNumId="8" w15:restartNumberingAfterBreak="0">
     <w:nsid w:val="4CF93599"/>
     <w:multiLevelType w:val="hybridMultilevel"/>
     <w:tmpl w:val="ABEA9A4A"/>
@@ -2022,7 +3626,7 @@
       </w:rPr>
     </w:lvl>
   </w:abstractNum>
-  <w:abstractNum w:abstractNumId="5" w15:restartNumberingAfterBreak="0">
+  <w:abstractNum w:abstractNumId="9" w15:restartNumberingAfterBreak="0">
     <w:nsid w:val="54806A94"/>
     <w:multiLevelType w:val="hybridMultilevel"/>
     <w:tmpl w:val="B89CD47E"/>
@@ -2135,7 +3739,7 @@
       </w:rPr>
     </w:lvl>
   </w:abstractNum>
-  <w:abstractNum w:abstractNumId="6" w15:restartNumberingAfterBreak="0">
+  <w:abstractNum w:abstractNumId="10" w15:restartNumberingAfterBreak="0">
     <w:nsid w:val="58B976EF"/>
     <w:multiLevelType w:val="hybridMultilevel"/>
     <w:tmpl w:val="3D3220FA"/>
@@ -2247,7 +3851,235 @@
       </w:rPr>
     </w:lvl>
   </w:abstractNum>
-  <w:abstractNum w:abstractNumId="7" w15:restartNumberingAfterBreak="0">
+  <w:abstractNum w:abstractNumId="11" w15:restartNumberingAfterBreak="0">
+    <w:nsid w:val="5E070469"/>
+    <w:multiLevelType w:val="hybridMultilevel"/>
+    <w:tmpl w:val="1CB4AB40"/>
+    <w:lvl w:ilvl="0" w:tplc="20000001">
+      <w:start w:val="1"/>
+      <w:numFmt w:val="bullet"/>
+      <w:lvlText w:val=""/>
+      <w:lvlJc w:val="left"/>
+      <w:pPr>
+        <w:ind w:left="720" w:hanging="360"/>
+      </w:pPr>
+      <w:rPr>
+        <w:rFonts w:ascii="Symbol" w:hAnsi="Symbol" w:hint="default"/>
+        <w:i/>
+        <w:color w:val="124F1A" w:themeColor="accent3" w:themeShade="BF"/>
+      </w:rPr>
+    </w:lvl>
+    <w:lvl w:ilvl="1" w:tplc="20000003" w:tentative="1">
+      <w:start w:val="1"/>
+      <w:numFmt w:val="bullet"/>
+      <w:lvlText w:val="o"/>
+      <w:lvlJc w:val="left"/>
+      <w:pPr>
+        <w:ind w:left="1440" w:hanging="360"/>
+      </w:pPr>
+      <w:rPr>
+        <w:rFonts w:ascii="Courier New" w:hAnsi="Courier New" w:cs="Courier New" w:hint="default"/>
+      </w:rPr>
+    </w:lvl>
+    <w:lvl w:ilvl="2" w:tplc="20000005" w:tentative="1">
+      <w:start w:val="1"/>
+      <w:numFmt w:val="bullet"/>
+      <w:lvlText w:val=""/>
+      <w:lvlJc w:val="left"/>
+      <w:pPr>
+        <w:ind w:left="2160" w:hanging="360"/>
+      </w:pPr>
+      <w:rPr>
+        <w:rFonts w:ascii="Wingdings" w:hAnsi="Wingdings" w:hint="default"/>
+      </w:rPr>
+    </w:lvl>
+    <w:lvl w:ilvl="3" w:tplc="20000001" w:tentative="1">
+      <w:start w:val="1"/>
+      <w:numFmt w:val="bullet"/>
+      <w:lvlText w:val=""/>
+      <w:lvlJc w:val="left"/>
+      <w:pPr>
+        <w:ind w:left="2880" w:hanging="360"/>
+      </w:pPr>
+      <w:rPr>
+        <w:rFonts w:ascii="Symbol" w:hAnsi="Symbol" w:hint="default"/>
+      </w:rPr>
+    </w:lvl>
+    <w:lvl w:ilvl="4" w:tplc="20000003" w:tentative="1">
+      <w:start w:val="1"/>
+      <w:numFmt w:val="bullet"/>
+      <w:lvlText w:val="o"/>
+      <w:lvlJc w:val="left"/>
+      <w:pPr>
+        <w:ind w:left="3600" w:hanging="360"/>
+      </w:pPr>
+      <w:rPr>
+        <w:rFonts w:ascii="Courier New" w:hAnsi="Courier New" w:cs="Courier New" w:hint="default"/>
+      </w:rPr>
+    </w:lvl>
+    <w:lvl w:ilvl="5" w:tplc="20000005" w:tentative="1">
+      <w:start w:val="1"/>
+      <w:numFmt w:val="bullet"/>
+      <w:lvlText w:val=""/>
+      <w:lvlJc w:val="left"/>
+      <w:pPr>
+        <w:ind w:left="4320" w:hanging="360"/>
+      </w:pPr>
+      <w:rPr>
+        <w:rFonts w:ascii="Wingdings" w:hAnsi="Wingdings" w:hint="default"/>
+      </w:rPr>
+    </w:lvl>
+    <w:lvl w:ilvl="6" w:tplc="20000001" w:tentative="1">
+      <w:start w:val="1"/>
+      <w:numFmt w:val="bullet"/>
+      <w:lvlText w:val=""/>
+      <w:lvlJc w:val="left"/>
+      <w:pPr>
+        <w:ind w:left="5040" w:hanging="360"/>
+      </w:pPr>
+      <w:rPr>
+        <w:rFonts w:ascii="Symbol" w:hAnsi="Symbol" w:hint="default"/>
+      </w:rPr>
+    </w:lvl>
+    <w:lvl w:ilvl="7" w:tplc="20000003" w:tentative="1">
+      <w:start w:val="1"/>
+      <w:numFmt w:val="bullet"/>
+      <w:lvlText w:val="o"/>
+      <w:lvlJc w:val="left"/>
+      <w:pPr>
+        <w:ind w:left="5760" w:hanging="360"/>
+      </w:pPr>
+      <w:rPr>
+        <w:rFonts w:ascii="Courier New" w:hAnsi="Courier New" w:cs="Courier New" w:hint="default"/>
+      </w:rPr>
+    </w:lvl>
+    <w:lvl w:ilvl="8" w:tplc="20000005" w:tentative="1">
+      <w:start w:val="1"/>
+      <w:numFmt w:val="bullet"/>
+      <w:lvlText w:val=""/>
+      <w:lvlJc w:val="left"/>
+      <w:pPr>
+        <w:ind w:left="6480" w:hanging="360"/>
+      </w:pPr>
+      <w:rPr>
+        <w:rFonts w:ascii="Wingdings" w:hAnsi="Wingdings" w:hint="default"/>
+      </w:rPr>
+    </w:lvl>
+  </w:abstractNum>
+  <w:abstractNum w:abstractNumId="12" w15:restartNumberingAfterBreak="0">
+    <w:nsid w:val="6CDE3DE8"/>
+    <w:multiLevelType w:val="hybridMultilevel"/>
+    <w:tmpl w:val="44247890"/>
+    <w:lvl w:ilvl="0" w:tplc="20000001">
+      <w:start w:val="1"/>
+      <w:numFmt w:val="bullet"/>
+      <w:lvlText w:val=""/>
+      <w:lvlJc w:val="left"/>
+      <w:pPr>
+        <w:ind w:left="1080" w:hanging="360"/>
+      </w:pPr>
+      <w:rPr>
+        <w:rFonts w:ascii="Symbol" w:hAnsi="Symbol" w:hint="default"/>
+      </w:rPr>
+    </w:lvl>
+    <w:lvl w:ilvl="1" w:tplc="20000003" w:tentative="1">
+      <w:start w:val="1"/>
+      <w:numFmt w:val="bullet"/>
+      <w:lvlText w:val="o"/>
+      <w:lvlJc w:val="left"/>
+      <w:pPr>
+        <w:ind w:left="1800" w:hanging="360"/>
+      </w:pPr>
+      <w:rPr>
+        <w:rFonts w:ascii="Courier New" w:hAnsi="Courier New" w:cs="Courier New" w:hint="default"/>
+      </w:rPr>
+    </w:lvl>
+    <w:lvl w:ilvl="2" w:tplc="20000005" w:tentative="1">
+      <w:start w:val="1"/>
+      <w:numFmt w:val="bullet"/>
+      <w:lvlText w:val=""/>
+      <w:lvlJc w:val="left"/>
+      <w:pPr>
+        <w:ind w:left="2520" w:hanging="360"/>
+      </w:pPr>
+      <w:rPr>
+        <w:rFonts w:ascii="Wingdings" w:hAnsi="Wingdings" w:hint="default"/>
+      </w:rPr>
+    </w:lvl>
+    <w:lvl w:ilvl="3" w:tplc="20000001" w:tentative="1">
+      <w:start w:val="1"/>
+      <w:numFmt w:val="bullet"/>
+      <w:lvlText w:val=""/>
+      <w:lvlJc w:val="left"/>
+      <w:pPr>
+        <w:ind w:left="3240" w:hanging="360"/>
+      </w:pPr>
+      <w:rPr>
+        <w:rFonts w:ascii="Symbol" w:hAnsi="Symbol" w:hint="default"/>
+      </w:rPr>
+    </w:lvl>
+    <w:lvl w:ilvl="4" w:tplc="20000003" w:tentative="1">
+      <w:start w:val="1"/>
+      <w:numFmt w:val="bullet"/>
+      <w:lvlText w:val="o"/>
+      <w:lvlJc w:val="left"/>
+      <w:pPr>
+        <w:ind w:left="3960" w:hanging="360"/>
+      </w:pPr>
+      <w:rPr>
+        <w:rFonts w:ascii="Courier New" w:hAnsi="Courier New" w:cs="Courier New" w:hint="default"/>
+      </w:rPr>
+    </w:lvl>
+    <w:lvl w:ilvl="5" w:tplc="20000005" w:tentative="1">
+      <w:start w:val="1"/>
+      <w:numFmt w:val="bullet"/>
+      <w:lvlText w:val=""/>
+      <w:lvlJc w:val="left"/>
+      <w:pPr>
+        <w:ind w:left="4680" w:hanging="360"/>
+      </w:pPr>
+      <w:rPr>
+        <w:rFonts w:ascii="Wingdings" w:hAnsi="Wingdings" w:hint="default"/>
+      </w:rPr>
+    </w:lvl>
+    <w:lvl w:ilvl="6" w:tplc="20000001" w:tentative="1">
+      <w:start w:val="1"/>
+      <w:numFmt w:val="bullet"/>
+      <w:lvlText w:val=""/>
+      <w:lvlJc w:val="left"/>
+      <w:pPr>
+        <w:ind w:left="5400" w:hanging="360"/>
+      </w:pPr>
+      <w:rPr>
+        <w:rFonts w:ascii="Symbol" w:hAnsi="Symbol" w:hint="default"/>
+      </w:rPr>
+    </w:lvl>
+    <w:lvl w:ilvl="7" w:tplc="20000003" w:tentative="1">
+      <w:start w:val="1"/>
+      <w:numFmt w:val="bullet"/>
+      <w:lvlText w:val="o"/>
+      <w:lvlJc w:val="left"/>
+      <w:pPr>
+        <w:ind w:left="6120" w:hanging="360"/>
+      </w:pPr>
+      <w:rPr>
+        <w:rFonts w:ascii="Courier New" w:hAnsi="Courier New" w:cs="Courier New" w:hint="default"/>
+      </w:rPr>
+    </w:lvl>
+    <w:lvl w:ilvl="8" w:tplc="20000005" w:tentative="1">
+      <w:start w:val="1"/>
+      <w:numFmt w:val="bullet"/>
+      <w:lvlText w:val=""/>
+      <w:lvlJc w:val="left"/>
+      <w:pPr>
+        <w:ind w:left="6840" w:hanging="360"/>
+      </w:pPr>
+      <w:rPr>
+        <w:rFonts w:ascii="Wingdings" w:hAnsi="Wingdings" w:hint="default"/>
+      </w:rPr>
+    </w:lvl>
+  </w:abstractNum>
+  <w:abstractNum w:abstractNumId="13" w15:restartNumberingAfterBreak="0">
     <w:nsid w:val="79575CFB"/>
     <w:multiLevelType w:val="hybridMultilevel"/>
     <w:tmpl w:val="17381DEE"/>
@@ -2360,28 +4192,46 @@
     </w:lvl>
   </w:abstractNum>
   <w:num w:numId="1" w16cid:durableId="1382679707">
+    <w:abstractNumId w:val="9"/>
+  </w:num>
+  <w:num w:numId="2" w16cid:durableId="1972203993">
+    <w:abstractNumId w:val="13"/>
+  </w:num>
+  <w:num w:numId="3" w16cid:durableId="1236431758">
+    <w:abstractNumId w:val="8"/>
+  </w:num>
+  <w:num w:numId="4" w16cid:durableId="1825583190">
+    <w:abstractNumId w:val="4"/>
+  </w:num>
+  <w:num w:numId="5" w16cid:durableId="295111290">
+    <w:abstractNumId w:val="2"/>
+  </w:num>
+  <w:num w:numId="6" w16cid:durableId="1470518995">
+    <w:abstractNumId w:val="3"/>
+  </w:num>
+  <w:num w:numId="7" w16cid:durableId="72433068">
+    <w:abstractNumId w:val="10"/>
+  </w:num>
+  <w:num w:numId="8" w16cid:durableId="1791388889">
+    <w:abstractNumId w:val="6"/>
+  </w:num>
+  <w:num w:numId="9" w16cid:durableId="1072389407">
+    <w:abstractNumId w:val="1"/>
+  </w:num>
+  <w:num w:numId="10" w16cid:durableId="2121147332">
+    <w:abstractNumId w:val="7"/>
+  </w:num>
+  <w:num w:numId="11" w16cid:durableId="897084419">
+    <w:abstractNumId w:val="11"/>
+  </w:num>
+  <w:num w:numId="12" w16cid:durableId="1766733040">
+    <w:abstractNumId w:val="0"/>
+  </w:num>
+  <w:num w:numId="13" w16cid:durableId="2056006492">
     <w:abstractNumId w:val="5"/>
   </w:num>
-  <w:num w:numId="2" w16cid:durableId="1972203993">
-    <w:abstractNumId w:val="7"/>
-  </w:num>
-  <w:num w:numId="3" w16cid:durableId="1236431758">
-    <w:abstractNumId w:val="4"/>
-  </w:num>
-  <w:num w:numId="4" w16cid:durableId="1825583190">
-    <w:abstractNumId w:val="2"/>
-  </w:num>
-  <w:num w:numId="5" w16cid:durableId="295111290">
-    <w:abstractNumId w:val="0"/>
-  </w:num>
-  <w:num w:numId="6" w16cid:durableId="1470518995">
-    <w:abstractNumId w:val="1"/>
-  </w:num>
-  <w:num w:numId="7" w16cid:durableId="72433068">
-    <w:abstractNumId w:val="6"/>
-  </w:num>
-  <w:num w:numId="8" w16cid:durableId="1791388889">
-    <w:abstractNumId w:val="3"/>
+  <w:num w:numId="14" w16cid:durableId="2007979112">
+    <w:abstractNumId w:val="12"/>
   </w:num>
 </w:numbering>
 </file>
@@ -2786,6 +4636,7 @@
   <w:style w:type="paragraph" w:default="1" w:styleId="Normal">
     <w:name w:val="Normal"/>
     <w:qFormat/>
+    <w:rsid w:val="00301093"/>
   </w:style>
   <w:style w:type="paragraph" w:styleId="Heading1">
     <w:name w:val="heading 1"/>
@@ -2858,7 +4709,6 @@
     <w:next w:val="Normal"/>
     <w:link w:val="Heading4Char"/>
     <w:uiPriority w:val="9"/>
-    <w:semiHidden/>
     <w:unhideWhenUsed/>
     <w:qFormat/>
     <w:rsid w:val="0022191F"/>
@@ -2881,7 +4731,6 @@
     <w:next w:val="Normal"/>
     <w:link w:val="Heading5Char"/>
     <w:uiPriority w:val="9"/>
-    <w:semiHidden/>
     <w:unhideWhenUsed/>
     <w:qFormat/>
     <w:rsid w:val="0022191F"/>
@@ -3054,7 +4903,6 @@
     <w:basedOn w:val="DefaultParagraphFont"/>
     <w:link w:val="Heading4"/>
     <w:uiPriority w:val="9"/>
-    <w:semiHidden/>
     <w:rsid w:val="0022191F"/>
     <w:rPr>
       <w:rFonts w:eastAsiaTheme="majorEastAsia" w:cstheme="majorBidi"/>
@@ -3068,7 +4916,6 @@
     <w:basedOn w:val="DefaultParagraphFont"/>
     <w:link w:val="Heading5"/>
     <w:uiPriority w:val="9"/>
-    <w:semiHidden/>
     <w:rsid w:val="0022191F"/>
     <w:rPr>
       <w:rFonts w:eastAsiaTheme="majorEastAsia" w:cstheme="majorBidi"/>

</xml_diff>